<commit_message>
Regenerate report with new synthesis/Fmax table, edge tests, extra SVA and error waveforms
</commit_message>
<xml_diff>
--- a/report/UART_IP_Core_Report.docx
+++ b/report/UART_IP_Core_Report.docx
@@ -2688,6 +2688,62 @@
               <w:rPr>
                 <w:sz w:val="17"/>
               </w:rPr>
+              <w:t>Edge cases: divisor 1/2/3/16/255/65535, reset in every TX and RX state, all 4 parity codes back-to-back, start glitches, bad stop, bad parity</w:t>
+            </w:r>
+          </w:p>
+        </w:tc>
+        <w:tc>
+          <w:tcPr>
+            <w:tcW w:type="dxa" w:w="3249"/>
+          </w:tcPr>
+          <w:p>
+            <w:r>
+              <w:rPr>
+                <w:sz w:val="17"/>
+              </w:rPr>
+            </w:r>
+            <w:r>
+              <w:rPr>
+                <w:sz w:val="17"/>
+              </w:rPr>
+              <w:t>tb_edge.sv (Verilator) + uart_sva_ext.sv</w:t>
+            </w:r>
+          </w:p>
+        </w:tc>
+        <w:tc>
+          <w:tcPr>
+            <w:tcW w:type="dxa" w:w="3249"/>
+          </w:tcPr>
+          <w:p>
+            <w:r>
+              <w:rPr>
+                <w:sz w:val="17"/>
+              </w:rPr>
+            </w:r>
+            <w:r>
+              <w:rPr>
+                <w:sz w:val="17"/>
+              </w:rPr>
+              <w:t>scoreboard + SVA</w:t>
+            </w:r>
+          </w:p>
+        </w:tc>
+      </w:tr>
+      <w:tr>
+        <w:tc>
+          <w:tcPr>
+            <w:tcW w:type="dxa" w:w="3249"/>
+          </w:tcPr>
+          <w:p>
+            <w:r>
+              <w:rPr>
+                <w:sz w:val="17"/>
+              </w:rPr>
+            </w:r>
+            <w:r>
+              <w:rPr>
+                <w:sz w:val="17"/>
+              </w:rPr>
               <w:t>Negative tests</w:t>
             </w:r>
           </w:p>
@@ -2714,6 +2770,32 @@
                 <w:sz w:val="17"/>
               </w:rPr>
               <w:t>+define+INJECT_BUG(_TX)</w:t>
+            </w:r>
+            <w:r>
+              <w:rPr>
+                <w:sz w:val="17"/>
+              </w:rPr>
+              <w:t xml:space="preserve">; tb_edge + </w:t>
+            </w:r>
+            <w:r>
+              <w:rPr>
+                <w:rFonts w:ascii="DejaVu Sans Mono" w:hAnsi="DejaVu Sans Mono"/>
+                <w:sz w:val="17"/>
+              </w:rPr>
+              <w:t>+define+INJECT_BUG_BAUD</w:t>
+            </w:r>
+            <w:r>
+              <w:rPr>
+                <w:sz w:val="17"/>
+              </w:rPr>
+              <w:t xml:space="preserve"> / </w:t>
+            </w:r>
+            <w:r>
+              <w:rPr>
+                <w:rFonts w:ascii="DejaVu Sans Mono" w:hAnsi="DejaVu Sans Mono"/>
+                <w:sz w:val="17"/>
+              </w:rPr>
+              <w:t>INJECT_BUG_RXMID</w:t>
             </w:r>
           </w:p>
         </w:tc>
@@ -6276,6 +6358,309 @@
     </w:p>
     <w:p>
       <w:pPr>
+        <w:pStyle w:val="Heading2"/>
+      </w:pPr>
+      <w:r>
+        <w:t>5.7 Edge-case testbench (tb_edge.sv)</w:t>
+      </w:r>
+    </w:p>
+    <w:p>
+      <w:r>
+        <w:rPr>
+          <w:rFonts w:ascii="DejaVu Sans Mono" w:hAnsi="DejaVu Sans Mono"/>
+          <w:sz w:val="18"/>
+        </w:rPr>
+        <w:t>make edge</w:t>
+      </w:r>
+      <w:r>
+        <w:t xml:space="preserve"> runs tb_edge with divisor 1, 2, 3, 16 and 255 (all groups) and 65535 (back-to-back groups only). All six runs ended </w:t>
+      </w:r>
+      <w:r>
+        <w:rPr>
+          <w:rFonts w:ascii="DejaVu Sans Mono" w:hAnsi="DejaVu Sans Mono"/>
+          <w:sz w:val="18"/>
+        </w:rPr>
+        <w:t>RESULT tb_edge ... : PASS (0 failing groups, 0 errors)</w:t>
+      </w:r>
+      <w:r>
+        <w:t xml:space="preserve"> (</w:t>
+      </w:r>
+      <w:r>
+        <w:rPr>
+          <w:rFonts w:ascii="DejaVu Sans Mono" w:hAnsi="DejaVu Sans Mono"/>
+          <w:sz w:val="18"/>
+        </w:rPr>
+        <w:t>logs/edge_div*.log</w:t>
+      </w:r>
+      <w:r>
+        <w:t>). Groups in each full run:</w:t>
+      </w:r>
+    </w:p>
+    <w:p>
+      <w:pPr>
+        <w:pStyle w:val="ListBullet"/>
+      </w:pPr>
+      <w:r>
+        <w:t xml:space="preserve">E4: 32 back-to-back frames with </w:t>
+      </w:r>
+      <w:r>
+        <w:rPr>
+          <w:rFonts w:ascii="DejaVu Sans Mono" w:hAnsi="DejaVu Sans Mono"/>
+          <w:sz w:val="18"/>
+        </w:rPr>
+        <w:t>tx_start</w:t>
+      </w:r>
+      <w:r>
+        <w:t xml:space="preserve"> held high, in parity codes 00, 01, 10 and 11;</w:t>
+      </w:r>
+    </w:p>
+    <w:p>
+      <w:pPr>
+        <w:pStyle w:val="ListBullet"/>
+      </w:pPr>
+      <w:r>
+        <w:t>E2: reset in TX states START, DATA, PARITY and STOP, then a good frame;</w:t>
+      </w:r>
+    </w:p>
+    <w:p>
+      <w:pPr>
+        <w:pStyle w:val="ListBullet"/>
+      </w:pPr>
+      <w:r>
+        <w:t>E3: reset in RX states START, DATA, PARITY, STOP and BREAK, with no byte allowed out, then a good frame;</w:t>
+      </w:r>
+    </w:p>
+    <w:p>
+      <w:pPr>
+        <w:pStyle w:val="ListBullet"/>
+      </w:pPr>
+      <w:r>
+        <w:t>E5a: start glitches from 1 clock to just under half a bit, which must be ignored;</w:t>
+      </w:r>
+    </w:p>
+    <w:p>
+      <w:pPr>
+        <w:pStyle w:val="ListBullet"/>
+      </w:pPr>
+      <w:r>
+        <w:t xml:space="preserve">E5b: stop bit = 0 in all four parity codes, which must give </w:t>
+      </w:r>
+      <w:r>
+        <w:rPr>
+          <w:rFonts w:ascii="DejaVu Sans Mono" w:hAnsi="DejaVu Sans Mono"/>
+          <w:sz w:val="18"/>
+        </w:rPr>
+        <w:t>frame_err</w:t>
+      </w:r>
+      <w:r>
+        <w:t xml:space="preserve"> without </w:t>
+      </w:r>
+      <w:r>
+        <w:rPr>
+          <w:rFonts w:ascii="DejaVu Sans Mono" w:hAnsi="DejaVu Sans Mono"/>
+          <w:sz w:val="18"/>
+        </w:rPr>
+        <w:t>rx_valid</w:t>
+      </w:r>
+      <w:r>
+        <w:t>;</w:t>
+      </w:r>
+    </w:p>
+    <w:p>
+      <w:pPr>
+        <w:pStyle w:val="ListBullet"/>
+      </w:pPr>
+      <w:r>
+        <w:t xml:space="preserve">E5c: a wrong parity bit for even and odd parity, which must give </w:t>
+      </w:r>
+      <w:r>
+        <w:rPr>
+          <w:rFonts w:ascii="DejaVu Sans Mono" w:hAnsi="DejaVu Sans Mono"/>
+          <w:sz w:val="18"/>
+        </w:rPr>
+        <w:t>parity_err</w:t>
+      </w:r>
+      <w:r>
+        <w:t>.</w:t>
+      </w:r>
+    </w:p>
+    <w:p>
+      <w:r>
+        <w:t>Waveforms from a traced run at DIV=4 (</w:t>
+      </w:r>
+      <w:r>
+        <w:rPr>
+          <w:rFonts w:ascii="DejaVu Sans Mono" w:hAnsi="DejaVu Sans Mono"/>
+          <w:sz w:val="18"/>
+        </w:rPr>
+        <w:t>make waves_err</w:t>
+      </w:r>
+      <w:r>
+        <w:t xml:space="preserve">, </w:t>
+      </w:r>
+      <w:r>
+        <w:rPr>
+          <w:rFonts w:ascii="DejaVu Sans Mono" w:hAnsi="DejaVu Sans Mono"/>
+          <w:sz w:val="18"/>
+        </w:rPr>
+        <w:t>waves/tb_edge_err.vcd</w:t>
+      </w:r>
+      <w:r>
+        <w:t>):</w:t>
+      </w:r>
+    </w:p>
+    <w:p>
+      <w:pPr>
+        <w:jc w:val="center"/>
+      </w:pPr>
+      <w:r>
+        <w:drawing>
+          <wp:inline xmlns:a="http://schemas.openxmlformats.org/drawingml/2006/main" xmlns:pic="http://schemas.openxmlformats.org/drawingml/2006/picture">
+            <wp:extent cx="5580000" cy="1927636"/>
+            <wp:docPr id="13" name="Picture 13"/>
+            <wp:cNvGraphicFramePr>
+              <a:graphicFrameLocks noChangeAspect="1"/>
+            </wp:cNvGraphicFramePr>
+            <a:graphic>
+              <a:graphicData uri="http://schemas.openxmlformats.org/drawingml/2006/picture">
+                <pic:pic>
+                  <pic:nvPicPr>
+                    <pic:cNvPr id="0" name="wave_txrx_timing.png"/>
+                    <pic:cNvPicPr/>
+                  </pic:nvPicPr>
+                  <pic:blipFill>
+                    <a:blip r:embed="rId21"/>
+                    <a:stretch>
+                      <a:fillRect/>
+                    </a:stretch>
+                  </pic:blipFill>
+                  <pic:spPr>
+                    <a:xfrm>
+                      <a:off x="0" y="0"/>
+                      <a:ext cx="5580000" cy="1927636"/>
+                    </a:xfrm>
+                    <a:prstGeom prst="rect"/>
+                  </pic:spPr>
+                </pic:pic>
+              </a:graphicData>
+            </a:graphic>
+          </wp:inline>
+        </w:drawing>
+      </w:r>
+    </w:p>
+    <w:p>
+      <w:pPr>
+        <w:jc w:val="center"/>
+      </w:pPr>
+      <w:r>
+        <w:rPr>
+          <w:i/>
+        </w:rPr>
+        <w:t>Figure 13: back-to-back frames, DUT tx looped to rx.</w:t>
+      </w:r>
+    </w:p>
+    <w:p>
+      <w:pPr>
+        <w:jc w:val="center"/>
+      </w:pPr>
+      <w:r>
+        <w:drawing>
+          <wp:inline xmlns:a="http://schemas.openxmlformats.org/drawingml/2006/main" xmlns:pic="http://schemas.openxmlformats.org/drawingml/2006/picture">
+            <wp:extent cx="5580000" cy="1927636"/>
+            <wp:docPr id="14" name="Picture 14"/>
+            <wp:cNvGraphicFramePr>
+              <a:graphicFrameLocks noChangeAspect="1"/>
+            </wp:cNvGraphicFramePr>
+            <a:graphic>
+              <a:graphicData uri="http://schemas.openxmlformats.org/drawingml/2006/picture">
+                <pic:pic>
+                  <pic:nvPicPr>
+                    <pic:cNvPr id="0" name="wave_parity_err.png"/>
+                    <pic:cNvPicPr/>
+                  </pic:nvPicPr>
+                  <pic:blipFill>
+                    <a:blip r:embed="rId22"/>
+                    <a:stretch>
+                      <a:fillRect/>
+                    </a:stretch>
+                  </pic:blipFill>
+                  <pic:spPr>
+                    <a:xfrm>
+                      <a:off x="0" y="0"/>
+                      <a:ext cx="5580000" cy="1927636"/>
+                    </a:xfrm>
+                    <a:prstGeom prst="rect"/>
+                  </pic:spPr>
+                </pic:pic>
+              </a:graphicData>
+            </a:graphic>
+          </wp:inline>
+        </w:drawing>
+      </w:r>
+    </w:p>
+    <w:p>
+      <w:pPr>
+        <w:jc w:val="center"/>
+      </w:pPr>
+      <w:r>
+        <w:rPr>
+          <w:i/>
+        </w:rPr>
+        <w:t>Figure 14: 0x96 with a wrong even-parity bit (parity_err with rx_valid), then a good 0x97.</w:t>
+      </w:r>
+    </w:p>
+    <w:p>
+      <w:pPr>
+        <w:jc w:val="center"/>
+      </w:pPr>
+      <w:r>
+        <w:drawing>
+          <wp:inline xmlns:a="http://schemas.openxmlformats.org/drawingml/2006/main" xmlns:pic="http://schemas.openxmlformats.org/drawingml/2006/picture">
+            <wp:extent cx="5580000" cy="1927636"/>
+            <wp:docPr id="15" name="Picture 15"/>
+            <wp:cNvGraphicFramePr>
+              <a:graphicFrameLocks noChangeAspect="1"/>
+            </wp:cNvGraphicFramePr>
+            <a:graphic>
+              <a:graphicData uri="http://schemas.openxmlformats.org/drawingml/2006/picture">
+                <pic:pic>
+                  <pic:nvPicPr>
+                    <pic:cNvPr id="0" name="wave_frame_err.png"/>
+                    <pic:cNvPicPr/>
+                  </pic:nvPicPr>
+                  <pic:blipFill>
+                    <a:blip r:embed="rId23"/>
+                    <a:stretch>
+                      <a:fillRect/>
+                    </a:stretch>
+                  </pic:blipFill>
+                  <pic:spPr>
+                    <a:xfrm>
+                      <a:off x="0" y="0"/>
+                      <a:ext cx="5580000" cy="1927636"/>
+                    </a:xfrm>
+                    <a:prstGeom prst="rect"/>
+                  </pic:spPr>
+                </pic:pic>
+              </a:graphicData>
+            </a:graphic>
+          </wp:inline>
+        </w:drawing>
+      </w:r>
+    </w:p>
+    <w:p>
+      <w:pPr>
+        <w:jc w:val="center"/>
+      </w:pPr>
+      <w:r>
+        <w:rPr>
+          <w:i/>
+        </w:rPr>
+        <w:t>Figure 15: 0xC9 with stop bit 0 and the line held low; frame_err pulses, no rx_valid.</w:t>
+      </w:r>
+    </w:p>
+    <w:p>
+      <w:pPr>
         <w:pStyle w:val="Heading1"/>
       </w:pPr>
       <w:r>
@@ -6979,6 +7364,360 @@
                 <w:sz w:val="17"/>
               </w:rPr>
               <w:t>625,787</w:t>
+            </w:r>
+          </w:p>
+        </w:tc>
+      </w:tr>
+    </w:tbl>
+    <w:p/>
+    <w:p>
+      <w:r>
+        <w:rPr>
+          <w:rFonts w:ascii="DejaVu Sans Mono" w:hAnsi="DejaVu Sans Mono"/>
+          <w:sz w:val="18"/>
+        </w:rPr>
+        <w:t>sva/uart_sva_ext.sv</w:t>
+      </w:r>
+      <w:r>
+        <w:t xml:space="preserve"> adds four checks, used by tb_edge. Hits are for DIV=16 (</w:t>
+      </w:r>
+      <w:r>
+        <w:rPr>
+          <w:rFonts w:ascii="DejaVu Sans Mono" w:hAnsi="DejaVu Sans Mono"/>
+          <w:sz w:val="18"/>
+        </w:rPr>
+        <w:t>logs/edge_div16.log</w:t>
+      </w:r>
+      <w:r>
+        <w:t>):</w:t>
+      </w:r>
+    </w:p>
+    <w:tbl>
+      <w:tblPr>
+        <w:tblStyle w:val="TableGrid"/>
+        <w:tblW w:type="auto" w:w="0"/>
+        <w:tblLook w:firstColumn="1" w:firstRow="1" w:lastColumn="0" w:lastRow="0" w:noHBand="0" w:noVBand="1" w:val="04A0"/>
+      </w:tblPr>
+      <w:tblGrid>
+        <w:gridCol w:w="3249"/>
+        <w:gridCol w:w="3249"/>
+        <w:gridCol w:w="3249"/>
+      </w:tblGrid>
+      <w:tr>
+        <w:tc>
+          <w:tcPr>
+            <w:tcW w:type="dxa" w:w="3249"/>
+          </w:tcPr>
+          <w:p>
+            <w:r>
+              <w:rPr>
+                <w:b/>
+                <w:sz w:val="17"/>
+              </w:rPr>
+            </w:r>
+            <w:r>
+              <w:rPr>
+                <w:b/>
+                <w:sz w:val="17"/>
+              </w:rPr>
+              <w:t>ID</w:t>
+            </w:r>
+          </w:p>
+        </w:tc>
+        <w:tc>
+          <w:tcPr>
+            <w:tcW w:type="dxa" w:w="3249"/>
+          </w:tcPr>
+          <w:p>
+            <w:r>
+              <w:rPr>
+                <w:b/>
+                <w:sz w:val="17"/>
+              </w:rPr>
+            </w:r>
+            <w:r>
+              <w:rPr>
+                <w:b/>
+                <w:sz w:val="17"/>
+              </w:rPr>
+              <w:t>Property</w:t>
+            </w:r>
+          </w:p>
+        </w:tc>
+        <w:tc>
+          <w:tcPr>
+            <w:tcW w:type="dxa" w:w="3249"/>
+          </w:tcPr>
+          <w:p>
+            <w:r>
+              <w:rPr>
+                <w:b/>
+                <w:sz w:val="17"/>
+              </w:rPr>
+            </w:r>
+            <w:r>
+              <w:rPr>
+                <w:b/>
+                <w:sz w:val="17"/>
+              </w:rPr>
+              <w:t>Hits</w:t>
+            </w:r>
+          </w:p>
+        </w:tc>
+      </w:tr>
+      <w:tr>
+        <w:tc>
+          <w:tcPr>
+            <w:tcW w:type="dxa" w:w="3249"/>
+          </w:tcPr>
+          <w:p>
+            <w:r>
+              <w:rPr>
+                <w:sz w:val="17"/>
+              </w:rPr>
+            </w:r>
+            <w:r>
+              <w:rPr>
+                <w:sz w:val="17"/>
+              </w:rPr>
+              <w:t>B1/B1b</w:t>
+            </w:r>
+          </w:p>
+        </w:tc>
+        <w:tc>
+          <w:tcPr>
+            <w:tcW w:type="dxa" w:w="3249"/>
+          </w:tcPr>
+          <w:p>
+            <w:r>
+              <w:rPr>
+                <w:sz w:val="17"/>
+              </w:rPr>
+            </w:r>
+            <w:r>
+              <w:rPr>
+                <w:sz w:val="17"/>
+              </w:rPr>
+              <w:t xml:space="preserve">every baud tick comes exactly </w:t>
+            </w:r>
+            <w:r>
+              <w:rPr>
+                <w:rFonts w:ascii="DejaVu Sans Mono" w:hAnsi="DejaVu Sans Mono"/>
+                <w:sz w:val="17"/>
+              </w:rPr>
+              <w:t>divisor</w:t>
+            </w:r>
+            <w:r>
+              <w:rPr>
+                <w:sz w:val="17"/>
+              </w:rPr>
+              <w:t xml:space="preserve"> clocks after the previous one, never later</w:t>
+            </w:r>
+          </w:p>
+        </w:tc>
+        <w:tc>
+          <w:tcPr>
+            <w:tcW w:type="dxa" w:w="3249"/>
+          </w:tcPr>
+          <w:p>
+            <w:r>
+              <w:rPr>
+                <w:sz w:val="17"/>
+              </w:rPr>
+            </w:r>
+            <w:r>
+              <w:rPr>
+                <w:sz w:val="17"/>
+              </w:rPr>
+              <w:t>29,873 ticks</w:t>
+            </w:r>
+          </w:p>
+        </w:tc>
+      </w:tr>
+      <w:tr>
+        <w:tc>
+          <w:tcPr>
+            <w:tcW w:type="dxa" w:w="3249"/>
+          </w:tcPr>
+          <w:p>
+            <w:r>
+              <w:rPr>
+                <w:sz w:val="17"/>
+              </w:rPr>
+            </w:r>
+            <w:r>
+              <w:rPr>
+                <w:sz w:val="17"/>
+              </w:rPr>
+              <w:t>B2</w:t>
+            </w:r>
+          </w:p>
+        </w:tc>
+        <w:tc>
+          <w:tcPr>
+            <w:tcW w:type="dxa" w:w="3249"/>
+          </w:tcPr>
+          <w:p>
+            <w:r>
+              <w:rPr>
+                <w:sz w:val="17"/>
+              </w:rPr>
+            </w:r>
+            <w:r>
+              <w:rPr>
+                <w:sz w:val="17"/>
+              </w:rPr>
+              <w:t>RX samples the start bit 8 ticks after detection, data bit n at 8+16(n+1) ticks</w:t>
+            </w:r>
+          </w:p>
+        </w:tc>
+        <w:tc>
+          <w:tcPr>
+            <w:tcW w:type="dxa" w:w="3249"/>
+          </w:tcPr>
+          <w:p>
+            <w:r>
+              <w:rPr>
+                <w:sz w:val="17"/>
+              </w:rPr>
+            </w:r>
+            <w:r>
+              <w:rPr>
+                <w:sz w:val="17"/>
+              </w:rPr>
+              <w:t>160 start / 1,240 data samples</w:t>
+            </w:r>
+          </w:p>
+        </w:tc>
+      </w:tr>
+      <w:tr>
+        <w:tc>
+          <w:tcPr>
+            <w:tcW w:type="dxa" w:w="3249"/>
+          </w:tcPr>
+          <w:p>
+            <w:r>
+              <w:rPr>
+                <w:sz w:val="17"/>
+              </w:rPr>
+            </w:r>
+            <w:r>
+              <w:rPr>
+                <w:sz w:val="17"/>
+              </w:rPr>
+              <w:t>B3</w:t>
+            </w:r>
+          </w:p>
+        </w:tc>
+        <w:tc>
+          <w:tcPr>
+            <w:tcW w:type="dxa" w:w="3249"/>
+          </w:tcPr>
+          <w:p>
+            <w:r>
+              <w:rPr>
+                <w:sz w:val="17"/>
+              </w:rPr>
+            </w:r>
+            <w:r>
+              <w:rPr>
+                <w:sz w:val="17"/>
+              </w:rPr>
+              <w:t>while reset is held and at release: tx=1, not busy, FSMs idle, no rx_valid/parity_err/frame_err</w:t>
+            </w:r>
+          </w:p>
+        </w:tc>
+        <w:tc>
+          <w:tcPr>
+            <w:tcW w:type="dxa" w:w="3249"/>
+          </w:tcPr>
+          <w:p>
+            <w:r>
+              <w:rPr>
+                <w:sz w:val="17"/>
+              </w:rPr>
+            </w:r>
+            <w:r>
+              <w:rPr>
+                <w:sz w:val="17"/>
+              </w:rPr>
+              <w:t>13 reset cycles</w:t>
+            </w:r>
+          </w:p>
+        </w:tc>
+      </w:tr>
+      <w:tr>
+        <w:tc>
+          <w:tcPr>
+            <w:tcW w:type="dxa" w:w="3249"/>
+          </w:tcPr>
+          <w:p>
+            <w:r>
+              <w:rPr>
+                <w:sz w:val="17"/>
+              </w:rPr>
+            </w:r>
+            <w:r>
+              <w:rPr>
+                <w:sz w:val="17"/>
+              </w:rPr>
+              <w:t>B4</w:t>
+            </w:r>
+          </w:p>
+        </w:tc>
+        <w:tc>
+          <w:tcPr>
+            <w:tcW w:type="dxa" w:w="3249"/>
+          </w:tcPr>
+          <w:p>
+            <w:r>
+              <w:rPr>
+                <w:sz w:val="17"/>
+              </w:rPr>
+            </w:r>
+            <w:r>
+              <w:rPr>
+                <w:rFonts w:ascii="DejaVu Sans Mono" w:hAnsi="DejaVu Sans Mono"/>
+                <w:sz w:val="17"/>
+              </w:rPr>
+              <w:t>DIV_W</w:t>
+            </w:r>
+            <w:r>
+              <w:rPr>
+                <w:sz w:val="17"/>
+              </w:rPr>
+              <w:t xml:space="preserve"> in 1..32 (elaboration), </w:t>
+            </w:r>
+            <w:r>
+              <w:rPr>
+                <w:rFonts w:ascii="DejaVu Sans Mono" w:hAnsi="DejaVu Sans Mono"/>
+                <w:sz w:val="17"/>
+              </w:rPr>
+              <w:t>divisor != 0</w:t>
+            </w:r>
+            <w:r>
+              <w:rPr>
+                <w:sz w:val="17"/>
+              </w:rPr>
+              <w:t xml:space="preserve"> (run time)</w:t>
+            </w:r>
+          </w:p>
+        </w:tc>
+        <w:tc>
+          <w:tcPr>
+            <w:tcW w:type="dxa" w:w="3249"/>
+          </w:tcPr>
+          <w:p>
+            <w:r>
+              <w:rPr>
+                <w:sz w:val="17"/>
+              </w:rPr>
+            </w:r>
+            <w:r>
+              <w:rPr>
+                <w:sz w:val="17"/>
+              </w:rPr>
+              <w:t>every cycle</w:t>
             </w:r>
           </w:p>
         </w:tc>
@@ -7065,6 +7804,54 @@
       </w:r>
     </w:p>
     <w:p>
+      <w:pPr>
+        <w:pStyle w:val="ListBullet"/>
+      </w:pPr>
+      <w:r>
+        <w:rPr>
+          <w:rFonts w:ascii="DejaVu Sans Mono" w:hAnsi="DejaVu Sans Mono"/>
+          <w:sz w:val="18"/>
+        </w:rPr>
+        <w:t>+define+INJECT_BUG_BAUD</w:t>
+      </w:r>
+      <w:r>
+        <w:t xml:space="preserve"> makes the baud counter off by one. It was caught by B1b at 0.33 µs, with </w:t>
+      </w:r>
+      <w:r>
+        <w:rPr>
+          <w:i/>
+        </w:rPr>
+        <w:t>"B1b no baud tick for 5 clocks (divisor=4)"</w:t>
+      </w:r>
+      <w:r>
+        <w:t>. Exit code 134.</w:t>
+      </w:r>
+    </w:p>
+    <w:p>
+      <w:pPr>
+        <w:pStyle w:val="ListBullet"/>
+      </w:pPr>
+      <w:r>
+        <w:rPr>
+          <w:rFonts w:ascii="DejaVu Sans Mono" w:hAnsi="DejaVu Sans Mono"/>
+          <w:sz w:val="18"/>
+        </w:rPr>
+        <w:t>+define+INJECT_BUG_RXMID</w:t>
+      </w:r>
+      <w:r>
+        <w:t xml:space="preserve"> starts RX sampling 3/16 bit late. It was caught by B2 at 1.11 µs, with </w:t>
+      </w:r>
+      <w:r>
+        <w:rPr>
+          <w:i/>
+        </w:rPr>
+        <w:t>"B2 start bit sampled at tick 11, expected 8"</w:t>
+      </w:r>
+      <w:r>
+        <w:t>. Exit code 134.</w:t>
+      </w:r>
+    </w:p>
+    <w:p>
       <w:r>
         <w:t>The negative tests show that the assertions are actually being evaluated, not passing vacuously.</w:t>
       </w:r>
@@ -7074,7 +7861,7 @@
         <w:pStyle w:val="Heading1"/>
       </w:pPr>
       <w:r>
-        <w:t>7. Synthesis (Yosys 0.52)</w:t>
+        <w:t>7. Synthesis (Yosys 0.52, nextpnr-ice40)</w:t>
       </w:r>
     </w:p>
     <w:p>
@@ -7140,6 +7927,25 @@
         <w:t>, to get a realistic count of LUT4 cells.</w:t>
       </w:r>
     </w:p>
+    <w:p>
+      <w:pPr>
+        <w:pStyle w:val="ListNumber"/>
+      </w:pPr>
+      <w:r>
+        <w:rPr>
+          <w:b/>
+        </w:rPr>
+        <w:t>Timing:</w:t>
+      </w:r>
+      <w:r>
+        <w:t xml:space="preserve"> nextpnr-ice40 place and route for iCE40 HX8K (ct256), seed 1, pins unconstrained. Its Fmax estimate is the only real timing number here.</w:t>
+      </w:r>
+    </w:p>
+    <w:p>
+      <w:r>
+        <w:t>Every feature row uses DIV_W=16 and parity support, so it differs from the first row only by the named feature.</w:t>
+      </w:r>
+    </w:p>
     <w:tbl>
       <w:tblPr>
         <w:tblStyle w:val="TableGrid"/>
@@ -7147,17 +7953,18 @@
         <w:tblLook w:firstColumn="1" w:firstRow="1" w:lastColumn="0" w:lastRow="0" w:noHBand="0" w:noVBand="1" w:val="04A0"/>
       </w:tblPr>
       <w:tblGrid>
-        <w:gridCol w:w="1624"/>
-        <w:gridCol w:w="1624"/>
-        <w:gridCol w:w="1624"/>
-        <w:gridCol w:w="1624"/>
-        <w:gridCol w:w="1624"/>
-        <w:gridCol w:w="1624"/>
+        <w:gridCol w:w="1392"/>
+        <w:gridCol w:w="1392"/>
+        <w:gridCol w:w="1392"/>
+        <w:gridCol w:w="1392"/>
+        <w:gridCol w:w="1392"/>
+        <w:gridCol w:w="1392"/>
+        <w:gridCol w:w="1392"/>
       </w:tblGrid>
       <w:tr>
         <w:tc>
           <w:tcPr>
-            <w:tcW w:type="dxa" w:w="1624"/>
+            <w:tcW w:type="dxa" w:w="1392"/>
           </w:tcPr>
           <w:p>
             <w:r>
@@ -7177,7 +7984,7 @@
         </w:tc>
         <w:tc>
           <w:tcPr>
-            <w:tcW w:type="dxa" w:w="1624"/>
+            <w:tcW w:type="dxa" w:w="1392"/>
           </w:tcPr>
           <w:p>
             <w:r>
@@ -7197,7 +8004,7 @@
         </w:tc>
         <w:tc>
           <w:tcPr>
-            <w:tcW w:type="dxa" w:w="1624"/>
+            <w:tcW w:type="dxa" w:w="1392"/>
           </w:tcPr>
           <w:p>
             <w:r>
@@ -7217,7 +8024,7 @@
         </w:tc>
         <w:tc>
           <w:tcPr>
-            <w:tcW w:type="dxa" w:w="1624"/>
+            <w:tcW w:type="dxa" w:w="1392"/>
           </w:tcPr>
           <w:p>
             <w:r>
@@ -7231,13 +8038,13 @@
                 <w:b/>
                 <w:sz w:val="17"/>
               </w:rPr>
-              <w:t>Depth</w:t>
-            </w:r>
-          </w:p>
-        </w:tc>
-        <w:tc>
-          <w:tcPr>
-            <w:tcW w:type="dxa" w:w="1624"/>
+              <w:t>Depth (gates)</w:t>
+            </w:r>
+          </w:p>
+        </w:tc>
+        <w:tc>
+          <w:tcPr>
+            <w:tcW w:type="dxa" w:w="1392"/>
           </w:tcPr>
           <w:p>
             <w:r>
@@ -7257,7 +8064,7 @@
         </w:tc>
         <w:tc>
           <w:tcPr>
-            <w:tcW w:type="dxa" w:w="1624"/>
+            <w:tcW w:type="dxa" w:w="1392"/>
           </w:tcPr>
           <w:p>
             <w:r>
@@ -7272,6 +8079,26 @@
                 <w:sz w:val="17"/>
               </w:rPr>
               <w:t>iCE40 DFF</w:t>
+            </w:r>
+          </w:p>
+        </w:tc>
+        <w:tc>
+          <w:tcPr>
+            <w:tcW w:type="dxa" w:w="1392"/>
+          </w:tcPr>
+          <w:p>
+            <w:r>
+              <w:rPr>
+                <w:b/>
+                <w:sz w:val="17"/>
+              </w:rPr>
+            </w:r>
+            <w:r>
+              <w:rPr>
+                <w:b/>
+                <w:sz w:val="17"/>
+              </w:rPr>
+              <w:t>Fmax (MHz)</w:t>
             </w:r>
           </w:p>
         </w:tc>
@@ -7279,7 +8106,7 @@
       <w:tr>
         <w:tc>
           <w:tcPr>
-            <w:tcW w:type="dxa" w:w="1624"/>
+            <w:tcW w:type="dxa" w:w="1392"/>
           </w:tcPr>
           <w:p>
             <w:r>
@@ -7297,7 +8124,7 @@
         </w:tc>
         <w:tc>
           <w:tcPr>
-            <w:tcW w:type="dxa" w:w="1624"/>
+            <w:tcW w:type="dxa" w:w="1392"/>
           </w:tcPr>
           <w:p>
             <w:r>
@@ -7315,7 +8142,7 @@
         </w:tc>
         <w:tc>
           <w:tcPr>
-            <w:tcW w:type="dxa" w:w="1624"/>
+            <w:tcW w:type="dxa" w:w="1392"/>
           </w:tcPr>
           <w:p>
             <w:r>
@@ -7333,7 +8160,7 @@
         </w:tc>
         <w:tc>
           <w:tcPr>
-            <w:tcW w:type="dxa" w:w="1624"/>
+            <w:tcW w:type="dxa" w:w="1392"/>
           </w:tcPr>
           <w:p>
             <w:r>
@@ -7351,7 +8178,7 @@
         </w:tc>
         <w:tc>
           <w:tcPr>
-            <w:tcW w:type="dxa" w:w="1624"/>
+            <w:tcW w:type="dxa" w:w="1392"/>
           </w:tcPr>
           <w:p>
             <w:r>
@@ -7369,7 +8196,7 @@
         </w:tc>
         <w:tc>
           <w:tcPr>
-            <w:tcW w:type="dxa" w:w="1624"/>
+            <w:tcW w:type="dxa" w:w="1392"/>
           </w:tcPr>
           <w:p>
             <w:r>
@@ -7382,6 +8209,24 @@
                 <w:sz w:val="17"/>
               </w:rPr>
               <w:t>88</w:t>
+            </w:r>
+          </w:p>
+        </w:tc>
+        <w:tc>
+          <w:tcPr>
+            <w:tcW w:type="dxa" w:w="1392"/>
+          </w:tcPr>
+          <w:p>
+            <w:r>
+              <w:rPr>
+                <w:sz w:val="17"/>
+              </w:rPr>
+            </w:r>
+            <w:r>
+              <w:rPr>
+                <w:sz w:val="17"/>
+              </w:rPr>
+              <w:t>141.78</w:t>
             </w:r>
           </w:p>
         </w:tc>
@@ -7389,7 +8234,7 @@
       <w:tr>
         <w:tc>
           <w:tcPr>
-            <w:tcW w:type="dxa" w:w="1624"/>
+            <w:tcW w:type="dxa" w:w="1392"/>
           </w:tcPr>
           <w:p>
             <w:r>
@@ -7407,7 +8252,7 @@
         </w:tc>
         <w:tc>
           <w:tcPr>
-            <w:tcW w:type="dxa" w:w="1624"/>
+            <w:tcW w:type="dxa" w:w="1392"/>
           </w:tcPr>
           <w:p>
             <w:r>
@@ -7425,7 +8270,7 @@
         </w:tc>
         <w:tc>
           <w:tcPr>
-            <w:tcW w:type="dxa" w:w="1624"/>
+            <w:tcW w:type="dxa" w:w="1392"/>
           </w:tcPr>
           <w:p>
             <w:r>
@@ -7443,7 +8288,7 @@
         </w:tc>
         <w:tc>
           <w:tcPr>
-            <w:tcW w:type="dxa" w:w="1624"/>
+            <w:tcW w:type="dxa" w:w="1392"/>
           </w:tcPr>
           <w:p>
             <w:r>
@@ -7461,7 +8306,7 @@
         </w:tc>
         <w:tc>
           <w:tcPr>
-            <w:tcW w:type="dxa" w:w="1624"/>
+            <w:tcW w:type="dxa" w:w="1392"/>
           </w:tcPr>
           <w:p>
             <w:r>
@@ -7479,7 +8324,7 @@
         </w:tc>
         <w:tc>
           <w:tcPr>
-            <w:tcW w:type="dxa" w:w="1624"/>
+            <w:tcW w:type="dxa" w:w="1392"/>
           </w:tcPr>
           <w:p>
             <w:r>
@@ -7492,6 +8337,24 @@
                 <w:sz w:val="17"/>
               </w:rPr>
               <w:t>72</w:t>
+            </w:r>
+          </w:p>
+        </w:tc>
+        <w:tc>
+          <w:tcPr>
+            <w:tcW w:type="dxa" w:w="1392"/>
+          </w:tcPr>
+          <w:p>
+            <w:r>
+              <w:rPr>
+                <w:sz w:val="17"/>
+              </w:rPr>
+            </w:r>
+            <w:r>
+              <w:rPr>
+                <w:sz w:val="17"/>
+              </w:rPr>
+              <w:t>142.78</w:t>
             </w:r>
           </w:p>
         </w:tc>
@@ -7499,7 +8362,7 @@
       <w:tr>
         <w:tc>
           <w:tcPr>
-            <w:tcW w:type="dxa" w:w="1624"/>
+            <w:tcW w:type="dxa" w:w="1392"/>
           </w:tcPr>
           <w:p>
             <w:r>
@@ -7517,7 +8380,7 @@
         </w:tc>
         <w:tc>
           <w:tcPr>
-            <w:tcW w:type="dxa" w:w="1624"/>
+            <w:tcW w:type="dxa" w:w="1392"/>
           </w:tcPr>
           <w:p>
             <w:r>
@@ -7535,7 +8398,7 @@
         </w:tc>
         <w:tc>
           <w:tcPr>
-            <w:tcW w:type="dxa" w:w="1624"/>
+            <w:tcW w:type="dxa" w:w="1392"/>
           </w:tcPr>
           <w:p>
             <w:r>
@@ -7553,7 +8416,7 @@
         </w:tc>
         <w:tc>
           <w:tcPr>
-            <w:tcW w:type="dxa" w:w="1624"/>
+            <w:tcW w:type="dxa" w:w="1392"/>
           </w:tcPr>
           <w:p>
             <w:r>
@@ -7571,7 +8434,7 @@
         </w:tc>
         <w:tc>
           <w:tcPr>
-            <w:tcW w:type="dxa" w:w="1624"/>
+            <w:tcW w:type="dxa" w:w="1392"/>
           </w:tcPr>
           <w:p>
             <w:r>
@@ -7589,7 +8452,7 @@
         </w:tc>
         <w:tc>
           <w:tcPr>
-            <w:tcW w:type="dxa" w:w="1624"/>
+            <w:tcW w:type="dxa" w:w="1392"/>
           </w:tcPr>
           <w:p>
             <w:r>
@@ -7602,6 +8465,24 @@
                 <w:sz w:val="17"/>
               </w:rPr>
               <w:t>82</w:t>
+            </w:r>
+          </w:p>
+        </w:tc>
+        <w:tc>
+          <w:tcPr>
+            <w:tcW w:type="dxa" w:w="1392"/>
+          </w:tcPr>
+          <w:p>
+            <w:r>
+              <w:rPr>
+                <w:sz w:val="17"/>
+              </w:rPr>
+            </w:r>
+            <w:r>
+              <w:rPr>
+                <w:sz w:val="17"/>
+              </w:rPr>
+              <w:t>124.60</w:t>
             </w:r>
           </w:p>
         </w:tc>
@@ -7609,7 +8490,7 @@
       <w:tr>
         <w:tc>
           <w:tcPr>
-            <w:tcW w:type="dxa" w:w="1624"/>
+            <w:tcW w:type="dxa" w:w="1392"/>
           </w:tcPr>
           <w:p>
             <w:r>
@@ -7627,7 +8508,7 @@
         </w:tc>
         <w:tc>
           <w:tcPr>
-            <w:tcW w:type="dxa" w:w="1624"/>
+            <w:tcW w:type="dxa" w:w="1392"/>
           </w:tcPr>
           <w:p>
             <w:r>
@@ -7645,7 +8526,7 @@
         </w:tc>
         <w:tc>
           <w:tcPr>
-            <w:tcW w:type="dxa" w:w="1624"/>
+            <w:tcW w:type="dxa" w:w="1392"/>
           </w:tcPr>
           <w:p>
             <w:r>
@@ -7663,7 +8544,7 @@
         </w:tc>
         <w:tc>
           <w:tcPr>
-            <w:tcW w:type="dxa" w:w="1624"/>
+            <w:tcW w:type="dxa" w:w="1392"/>
           </w:tcPr>
           <w:p>
             <w:r>
@@ -7681,7 +8562,7 @@
         </w:tc>
         <w:tc>
           <w:tcPr>
-            <w:tcW w:type="dxa" w:w="1624"/>
+            <w:tcW w:type="dxa" w:w="1392"/>
           </w:tcPr>
           <w:p>
             <w:r>
@@ -7699,7 +8580,7 @@
         </w:tc>
         <w:tc>
           <w:tcPr>
-            <w:tcW w:type="dxa" w:w="1624"/>
+            <w:tcW w:type="dxa" w:w="1392"/>
           </w:tcPr>
           <w:p>
             <w:r>
@@ -7712,6 +8593,24 @@
                 <w:sz w:val="17"/>
               </w:rPr>
               <w:t>139</w:t>
+            </w:r>
+          </w:p>
+        </w:tc>
+        <w:tc>
+          <w:tcPr>
+            <w:tcW w:type="dxa" w:w="1392"/>
+          </w:tcPr>
+          <w:p>
+            <w:r>
+              <w:rPr>
+                <w:sz w:val="17"/>
+              </w:rPr>
+            </w:r>
+            <w:r>
+              <w:rPr>
+                <w:sz w:val="17"/>
+              </w:rPr>
+              <w:t>73.92</w:t>
             </w:r>
           </w:p>
         </w:tc>
@@ -7719,7 +8618,7 @@
       <w:tr>
         <w:tc>
           <w:tcPr>
-            <w:tcW w:type="dxa" w:w="1624"/>
+            <w:tcW w:type="dxa" w:w="1392"/>
           </w:tcPr>
           <w:p>
             <w:r>
@@ -7737,7 +8636,7 @@
         </w:tc>
         <w:tc>
           <w:tcPr>
-            <w:tcW w:type="dxa" w:w="1624"/>
+            <w:tcW w:type="dxa" w:w="1392"/>
           </w:tcPr>
           <w:p>
             <w:r>
@@ -7755,7 +8654,7 @@
         </w:tc>
         <w:tc>
           <w:tcPr>
-            <w:tcW w:type="dxa" w:w="1624"/>
+            <w:tcW w:type="dxa" w:w="1392"/>
           </w:tcPr>
           <w:p>
             <w:r>
@@ -7773,7 +8672,7 @@
         </w:tc>
         <w:tc>
           <w:tcPr>
-            <w:tcW w:type="dxa" w:w="1624"/>
+            <w:tcW w:type="dxa" w:w="1392"/>
           </w:tcPr>
           <w:p>
             <w:r>
@@ -7791,25 +8690,25 @@
         </w:tc>
         <w:tc>
           <w:tcPr>
-            <w:tcW w:type="dxa" w:w="1624"/>
-          </w:tcPr>
-          <w:p>
-            <w:r>
-              <w:rPr>
-                <w:sz w:val="17"/>
-              </w:rPr>
-            </w:r>
-            <w:r>
-              <w:rPr>
-                <w:sz w:val="17"/>
-              </w:rPr>
-              <w:t>276</w:t>
-            </w:r>
-          </w:p>
-        </w:tc>
-        <w:tc>
-          <w:tcPr>
-            <w:tcW w:type="dxa" w:w="1624"/>
+            <w:tcW w:type="dxa" w:w="1392"/>
+          </w:tcPr>
+          <w:p>
+            <w:r>
+              <w:rPr>
+                <w:sz w:val="17"/>
+              </w:rPr>
+            </w:r>
+            <w:r>
+              <w:rPr>
+                <w:sz w:val="17"/>
+              </w:rPr>
+              <w:t>271</w:t>
+            </w:r>
+          </w:p>
+        </w:tc>
+        <w:tc>
+          <w:tcPr>
+            <w:tcW w:type="dxa" w:w="1392"/>
           </w:tcPr>
           <w:p>
             <w:r>
@@ -7822,6 +8721,24 @@
                 <w:sz w:val="17"/>
               </w:rPr>
               <w:t>151</w:t>
+            </w:r>
+          </w:p>
+        </w:tc>
+        <w:tc>
+          <w:tcPr>
+            <w:tcW w:type="dxa" w:w="1392"/>
+          </w:tcPr>
+          <w:p>
+            <w:r>
+              <w:rPr>
+                <w:sz w:val="17"/>
+              </w:rPr>
+            </w:r>
+            <w:r>
+              <w:rPr>
+                <w:sz w:val="17"/>
+              </w:rPr>
+              <w:t>128.52</w:t>
             </w:r>
           </w:p>
         </w:tc>
@@ -7829,7 +8746,7 @@
       <w:tr>
         <w:tc>
           <w:tcPr>
-            <w:tcW w:type="dxa" w:w="1624"/>
+            <w:tcW w:type="dxa" w:w="1392"/>
           </w:tcPr>
           <w:p>
             <w:r>
@@ -7847,7 +8764,7 @@
         </w:tc>
         <w:tc>
           <w:tcPr>
-            <w:tcW w:type="dxa" w:w="1624"/>
+            <w:tcW w:type="dxa" w:w="1392"/>
           </w:tcPr>
           <w:p>
             <w:r>
@@ -7865,7 +8782,7 @@
         </w:tc>
         <w:tc>
           <w:tcPr>
-            <w:tcW w:type="dxa" w:w="1624"/>
+            <w:tcW w:type="dxa" w:w="1392"/>
           </w:tcPr>
           <w:p>
             <w:r>
@@ -7883,7 +8800,7 @@
         </w:tc>
         <w:tc>
           <w:tcPr>
-            <w:tcW w:type="dxa" w:w="1624"/>
+            <w:tcW w:type="dxa" w:w="1392"/>
           </w:tcPr>
           <w:p>
             <w:r>
@@ -7901,7 +8818,7 @@
         </w:tc>
         <w:tc>
           <w:tcPr>
-            <w:tcW w:type="dxa" w:w="1624"/>
+            <w:tcW w:type="dxa" w:w="1392"/>
           </w:tcPr>
           <w:p>
             <w:r>
@@ -7919,7 +8836,7 @@
         </w:tc>
         <w:tc>
           <w:tcPr>
-            <w:tcW w:type="dxa" w:w="1624"/>
+            <w:tcW w:type="dxa" w:w="1392"/>
           </w:tcPr>
           <w:p>
             <w:r>
@@ -7932,6 +8849,24 @@
                 <w:sz w:val="17"/>
               </w:rPr>
               <w:t>88</w:t>
+            </w:r>
+          </w:p>
+        </w:tc>
+        <w:tc>
+          <w:tcPr>
+            <w:tcW w:type="dxa" w:w="1392"/>
+          </w:tcPr>
+          <w:p>
+            <w:r>
+              <w:rPr>
+                <w:sz w:val="17"/>
+              </w:rPr>
+            </w:r>
+            <w:r>
+              <w:rPr>
+                <w:sz w:val="17"/>
+              </w:rPr>
+              <w:t>126.25</w:t>
             </w:r>
           </w:p>
         </w:tc>
@@ -7939,7 +8874,7 @@
       <w:tr>
         <w:tc>
           <w:tcPr>
-            <w:tcW w:type="dxa" w:w="1624"/>
+            <w:tcW w:type="dxa" w:w="1392"/>
           </w:tcPr>
           <w:p>
             <w:r>
@@ -7957,25 +8892,25 @@
         </w:tc>
         <w:tc>
           <w:tcPr>
-            <w:tcW w:type="dxa" w:w="1624"/>
-          </w:tcPr>
-          <w:p>
-            <w:r>
-              <w:rPr>
-                <w:sz w:val="17"/>
-              </w:rPr>
-            </w:r>
-            <w:r>
-              <w:rPr>
-                <w:sz w:val="17"/>
-              </w:rPr>
-              <w:t>1507</w:t>
-            </w:r>
-          </w:p>
-        </w:tc>
-        <w:tc>
-          <w:tcPr>
-            <w:tcW w:type="dxa" w:w="1624"/>
+            <w:tcW w:type="dxa" w:w="1392"/>
+          </w:tcPr>
+          <w:p>
+            <w:r>
+              <w:rPr>
+                <w:sz w:val="17"/>
+              </w:rPr>
+            </w:r>
+            <w:r>
+              <w:rPr>
+                <w:sz w:val="17"/>
+              </w:rPr>
+              <w:t>1532</w:t>
+            </w:r>
+          </w:p>
+        </w:tc>
+        <w:tc>
+          <w:tcPr>
+            <w:tcW w:type="dxa" w:w="1392"/>
           </w:tcPr>
           <w:p>
             <w:r>
@@ -7993,25 +8928,25 @@
         </w:tc>
         <w:tc>
           <w:tcPr>
-            <w:tcW w:type="dxa" w:w="1624"/>
-          </w:tcPr>
-          <w:p>
-            <w:r>
-              <w:rPr>
-                <w:sz w:val="17"/>
-              </w:rPr>
-            </w:r>
-            <w:r>
-              <w:rPr>
-                <w:sz w:val="17"/>
-              </w:rPr>
-              <w:t>28</w:t>
-            </w:r>
-          </w:p>
-        </w:tc>
-        <w:tc>
-          <w:tcPr>
-            <w:tcW w:type="dxa" w:w="1624"/>
+            <w:tcW w:type="dxa" w:w="1392"/>
+          </w:tcPr>
+          <w:p>
+            <w:r>
+              <w:rPr>
+                <w:sz w:val="17"/>
+              </w:rPr>
+            </w:r>
+            <w:r>
+              <w:rPr>
+                <w:sz w:val="17"/>
+              </w:rPr>
+              <w:t>27</w:t>
+            </w:r>
+          </w:p>
+        </w:tc>
+        <w:tc>
+          <w:tcPr>
+            <w:tcW w:type="dxa" w:w="1392"/>
           </w:tcPr>
           <w:p>
             <w:r>
@@ -8029,7 +8964,7 @@
         </w:tc>
         <w:tc>
           <w:tcPr>
-            <w:tcW w:type="dxa" w:w="1624"/>
+            <w:tcW w:type="dxa" w:w="1392"/>
           </w:tcPr>
           <w:p>
             <w:r>
@@ -8042,6 +8977,24 @@
                 <w:sz w:val="17"/>
               </w:rPr>
               <w:t>172</w:t>
+            </w:r>
+          </w:p>
+        </w:tc>
+        <w:tc>
+          <w:tcPr>
+            <w:tcW w:type="dxa" w:w="1392"/>
+          </w:tcPr>
+          <w:p>
+            <w:r>
+              <w:rPr>
+                <w:sz w:val="17"/>
+              </w:rPr>
+            </w:r>
+            <w:r>
+              <w:rPr>
+                <w:sz w:val="17"/>
+              </w:rPr>
+              <w:t>75.71</w:t>
             </w:r>
           </w:p>
         </w:tc>
@@ -8049,7 +9002,7 @@
       <w:tr>
         <w:tc>
           <w:tcPr>
-            <w:tcW w:type="dxa" w:w="1624"/>
+            <w:tcW w:type="dxa" w:w="1392"/>
           </w:tcPr>
           <w:p>
             <w:r>
@@ -8067,25 +9020,25 @@
         </w:tc>
         <w:tc>
           <w:tcPr>
-            <w:tcW w:type="dxa" w:w="1624"/>
-          </w:tcPr>
-          <w:p>
-            <w:r>
-              <w:rPr>
-                <w:sz w:val="17"/>
-              </w:rPr>
-            </w:r>
-            <w:r>
-              <w:rPr>
-                <w:sz w:val="17"/>
-              </w:rPr>
-              <w:t>2720</w:t>
-            </w:r>
-          </w:p>
-        </w:tc>
-        <w:tc>
-          <w:tcPr>
-            <w:tcW w:type="dxa" w:w="1624"/>
+            <w:tcW w:type="dxa" w:w="1392"/>
+          </w:tcPr>
+          <w:p>
+            <w:r>
+              <w:rPr>
+                <w:sz w:val="17"/>
+              </w:rPr>
+            </w:r>
+            <w:r>
+              <w:rPr>
+                <w:sz w:val="17"/>
+              </w:rPr>
+              <w:t>2698</w:t>
+            </w:r>
+          </w:p>
+        </w:tc>
+        <w:tc>
+          <w:tcPr>
+            <w:tcW w:type="dxa" w:w="1392"/>
           </w:tcPr>
           <w:p>
             <w:r>
@@ -8103,7 +9056,7 @@
         </w:tc>
         <w:tc>
           <w:tcPr>
-            <w:tcW w:type="dxa" w:w="1624"/>
+            <w:tcW w:type="dxa" w:w="1392"/>
           </w:tcPr>
           <w:p>
             <w:r>
@@ -8121,25 +9074,25 @@
         </w:tc>
         <w:tc>
           <w:tcPr>
-            <w:tcW w:type="dxa" w:w="1624"/>
-          </w:tcPr>
-          <w:p>
-            <w:r>
-              <w:rPr>
-                <w:sz w:val="17"/>
-              </w:rPr>
-            </w:r>
-            <w:r>
-              <w:rPr>
-                <w:sz w:val="17"/>
-              </w:rPr>
-              <w:t>591</w:t>
-            </w:r>
-          </w:p>
-        </w:tc>
-        <w:tc>
-          <w:tcPr>
-            <w:tcW w:type="dxa" w:w="1624"/>
+            <w:tcW w:type="dxa" w:w="1392"/>
+          </w:tcPr>
+          <w:p>
+            <w:r>
+              <w:rPr>
+                <w:sz w:val="17"/>
+              </w:rPr>
+            </w:r>
+            <w:r>
+              <w:rPr>
+                <w:sz w:val="17"/>
+              </w:rPr>
+              <w:t>585</w:t>
+            </w:r>
+          </w:p>
+        </w:tc>
+        <w:tc>
+          <w:tcPr>
+            <w:tcW w:type="dxa" w:w="1392"/>
           </w:tcPr>
           <w:p>
             <w:r>
@@ -8152,6 +9105,24 @@
                 <w:sz w:val="17"/>
               </w:rPr>
               <w:t>318</w:t>
+            </w:r>
+          </w:p>
+        </w:tc>
+        <w:tc>
+          <w:tcPr>
+            <w:tcW w:type="dxa" w:w="1392"/>
+          </w:tcPr>
+          <w:p>
+            <w:r>
+              <w:rPr>
+                <w:sz w:val="17"/>
+              </w:rPr>
+            </w:r>
+            <w:r>
+              <w:rPr>
+                <w:sz w:val="17"/>
+              </w:rPr>
+              <w:t>73.87</w:t>
             </w:r>
           </w:p>
         </w:tc>
@@ -8181,7 +9152,7 @@
         <w:drawing>
           <wp:inline xmlns:a="http://schemas.openxmlformats.org/drawingml/2006/main" xmlns:pic="http://schemas.openxmlformats.org/drawingml/2006/picture">
             <wp:extent cx="5580000" cy="2232000"/>
-            <wp:docPr id="13" name="Picture 13"/>
+            <wp:docPr id="16" name="Picture 16"/>
             <wp:cNvGraphicFramePr>
               <a:graphicFrameLocks noChangeAspect="1"/>
             </wp:cNvGraphicFramePr>
@@ -8193,7 +9164,7 @@
                     <pic:cNvPicPr/>
                   </pic:nvPicPr>
                   <pic:blipFill>
-                    <a:blip r:embed="rId21"/>
+                    <a:blip r:embed="rId24"/>
                     <a:stretch>
                       <a:fillRect/>
                     </a:stretch>
@@ -8220,7 +9191,7 @@
         <w:rPr>
           <w:i/>
         </w:rPr>
-        <w:t>Figure 13: iCE40 LUT count per configuration.</w:t>
+        <w:t>Figure 16: iCE40 LUT count per configuration.</w:t>
       </w:r>
     </w:p>
     <w:p>
@@ -8265,7 +9236,15 @@
         <w:pStyle w:val="ListBullet"/>
       </w:pPr>
       <w:r>
-        <w:t>Without a timing library, logic depth is only a rough proxy for speed. I did not run timing analysis (nextpnr/STA).</w:t>
+        <w:t>Logic depth is a gate count, not a delay. The Fmax column is the measured iCE40 estimate: the base core reaches about 142 MHz, while auto-baud and the line monitor bring it down to about 74-76 MHz, so their wide counters/comparators set the critical path. No ASIC STA was done.</w:t>
+      </w:r>
+    </w:p>
+    <w:p>
+      <w:pPr>
+        <w:pStyle w:val="ListBullet"/>
+      </w:pPr>
+      <w:r>
+        <w:t>The removal of parity lowers Fmax (124.60 vs 141.78 MHz) even though it removes logic; place-and-route results vary with the netlist and seed, so small Fmax differences should not be over-read.</w:t>
       </w:r>
     </w:p>
     <w:p>
@@ -8316,6 +9295,14 @@
       </w:pPr>
       <w:r>
         <w:t>The power result is a toggle count from RTL simulation only. It is not a power estimate.</w:t>
+      </w:r>
+    </w:p>
+    <w:p>
+      <w:pPr>
+        <w:pStyle w:val="ListBullet"/>
+      </w:pPr>
+      <w:r>
+        <w:t>Fmax is a nextpnr estimate with unconstrained pins, not a board result.</w:t>
       </w:r>
     </w:p>
     <w:p>
@@ -8416,6 +9403,14 @@
         <w:pStyle w:val="ListBullet"/>
       </w:pPr>
       <w:r>
+        <w:t>6/6 edge-case runs (divisor 1 to 65535, reset in every TX/RX state, malformed frames);</w:t>
+      </w:r>
+    </w:p>
+    <w:p>
+      <w:pPr>
+        <w:pStyle w:val="ListBullet"/>
+      </w:pPr>
+      <w:r>
         <w:t>auto-baud locked to the nearest divisor at every point tested;</w:t>
       </w:r>
     </w:p>
@@ -8445,7 +9440,7 @@
     </w:p>
     <w:p>
       <w:r>
-        <w:t>The assertions caught both deliberately injected bugs. With every feature enabled, the core takes 591 iCE40 LUTs, compared with 174 for the base core.</w:t>
+        <w:t>The assertions caught all four deliberately injected bugs. With every feature enabled, the core takes 585 iCE40 LUTs and reaches 73.87 MHz on iCE40 HX8K, compared with 174 LUTs and 141.78 MHz for the base core.</w:t>
       </w:r>
     </w:p>
     <w:p>
@@ -8472,7 +9467,11 @@
         <w:br/>
         <w:t>make power                  # toggle-count proxy</w:t>
         <w:br/>
-        <w:t>make synth                  # Yosys table</w:t>
+        <w:t>make edge                   # edge cases + extra SVA</w:t>
+        <w:br/>
+        <w:t>make waves_err              # error waveforms</w:t>
+        <w:br/>
+        <w:t>make synth                  # Yosys + nextpnr table</w:t>
         <w:br/>
         <w:t>make report                 # figures + this PDF</w:t>
       </w:r>

</xml_diff>

<commit_message>
Add real GTKWave screenshots with .gtkw save files, injected-bug demo target and terminal capture
</commit_message>
<xml_diff>
--- a/report/UART_IP_Core_Report.docx
+++ b/report/UART_IP_Core_Report.docx
@@ -6661,6 +6661,793 @@
     </w:p>
     <w:p>
       <w:pPr>
+        <w:pStyle w:val="Heading2"/>
+      </w:pPr>
+      <w:r>
+        <w:t>5.8 GTKWave screenshots</w:t>
+      </w:r>
+    </w:p>
+    <w:p>
+      <w:r>
+        <w:t xml:space="preserve">These are real screenshots of GTKWave 3.3.121 with the saved VCDs open, not plots. Each view has a save file in </w:t>
+      </w:r>
+      <w:r>
+        <w:rPr>
+          <w:rFonts w:ascii="DejaVu Sans Mono" w:hAnsi="DejaVu Sans Mono"/>
+          <w:sz w:val="18"/>
+        </w:rPr>
+        <w:t>waves/</w:t>
+      </w:r>
+      <w:r>
+        <w:t xml:space="preserve"> (signals, hex radix for buses, zoom and marker), so it can be reopened with </w:t>
+      </w:r>
+      <w:r>
+        <w:rPr>
+          <w:rFonts w:ascii="DejaVu Sans Mono" w:hAnsi="DejaVu Sans Mono"/>
+          <w:sz w:val="18"/>
+        </w:rPr>
+        <w:t>gtkwave &lt;vcd&gt; &lt;gtkw&gt;</w:t>
+      </w:r>
+      <w:r>
+        <w:t xml:space="preserve">. </w:t>
+      </w:r>
+      <w:r>
+        <w:rPr>
+          <w:rFonts w:ascii="DejaVu Sans Mono" w:hAnsi="DejaVu Sans Mono"/>
+          <w:sz w:val="18"/>
+        </w:rPr>
+        <w:t>make gtkwave_shots</w:t>
+      </w:r>
+      <w:r>
+        <w:t xml:space="preserve"> regenerates the VCDs and the screenshots (it needs an X display, or run it under </w:t>
+      </w:r>
+      <w:r>
+        <w:rPr>
+          <w:rFonts w:ascii="DejaVu Sans Mono" w:hAnsi="DejaVu Sans Mono"/>
+          <w:sz w:val="18"/>
+        </w:rPr>
+        <w:t>xvfb-run</w:t>
+      </w:r>
+      <w:r>
+        <w:t xml:space="preserve">). </w:t>
+      </w:r>
+      <w:r>
+        <w:rPr>
+          <w:rFonts w:ascii="DejaVu Sans Mono" w:hAnsi="DejaVu Sans Mono"/>
+          <w:sz w:val="18"/>
+        </w:rPr>
+        <w:t>waves/tb_edge_err.vcd</w:t>
+      </w:r>
+      <w:r>
+        <w:t xml:space="preserve"> is not committed (8.7 MB); </w:t>
+      </w:r>
+      <w:r>
+        <w:rPr>
+          <w:rFonts w:ascii="DejaVu Sans Mono" w:hAnsi="DejaVu Sans Mono"/>
+          <w:sz w:val="18"/>
+        </w:rPr>
+        <w:t>make waves_err</w:t>
+      </w:r>
+      <w:r>
+        <w:t xml:space="preserve"> recreates it.</w:t>
+      </w:r>
+    </w:p>
+    <w:tbl>
+      <w:tblPr>
+        <w:tblStyle w:val="TableGrid"/>
+        <w:tblW w:type="auto" w:w="0"/>
+        <w:tblLook w:firstColumn="1" w:firstRow="1" w:lastColumn="0" w:lastRow="0" w:noHBand="0" w:noVBand="1" w:val="04A0"/>
+      </w:tblPr>
+      <w:tblGrid>
+        <w:gridCol w:w="3249"/>
+        <w:gridCol w:w="3249"/>
+        <w:gridCol w:w="3249"/>
+      </w:tblGrid>
+      <w:tr>
+        <w:tc>
+          <w:tcPr>
+            <w:tcW w:type="dxa" w:w="3249"/>
+          </w:tcPr>
+          <w:p>
+            <w:r>
+              <w:rPr>
+                <w:b/>
+                <w:sz w:val="17"/>
+              </w:rPr>
+            </w:r>
+            <w:r>
+              <w:rPr>
+                <w:b/>
+                <w:sz w:val="17"/>
+              </w:rPr>
+              <w:t>View</w:t>
+            </w:r>
+          </w:p>
+        </w:tc>
+        <w:tc>
+          <w:tcPr>
+            <w:tcW w:type="dxa" w:w="3249"/>
+          </w:tcPr>
+          <w:p>
+            <w:r>
+              <w:rPr>
+                <w:b/>
+                <w:sz w:val="17"/>
+              </w:rPr>
+            </w:r>
+            <w:r>
+              <w:rPr>
+                <w:b/>
+                <w:sz w:val="17"/>
+              </w:rPr>
+              <w:t>Open with</w:t>
+            </w:r>
+          </w:p>
+        </w:tc>
+        <w:tc>
+          <w:tcPr>
+            <w:tcW w:type="dxa" w:w="3249"/>
+          </w:tcPr>
+          <w:p>
+            <w:r>
+              <w:rPr>
+                <w:b/>
+                <w:sz w:val="17"/>
+              </w:rPr>
+            </w:r>
+            <w:r>
+              <w:rPr>
+                <w:b/>
+                <w:sz w:val="17"/>
+              </w:rPr>
+              <w:t>Window, marker</w:t>
+            </w:r>
+          </w:p>
+        </w:tc>
+      </w:tr>
+      <w:tr>
+        <w:tc>
+          <w:tcPr>
+            <w:tcW w:type="dxa" w:w="3249"/>
+          </w:tcPr>
+          <w:p>
+            <w:r>
+              <w:rPr>
+                <w:sz w:val="17"/>
+              </w:rPr>
+            </w:r>
+            <w:r>
+              <w:rPr>
+                <w:sz w:val="17"/>
+              </w:rPr>
+              <w:t>TX/RX loopback</w:t>
+            </w:r>
+          </w:p>
+        </w:tc>
+        <w:tc>
+          <w:tcPr>
+            <w:tcW w:type="dxa" w:w="3249"/>
+          </w:tcPr>
+          <w:p>
+            <w:r>
+              <w:rPr>
+                <w:sz w:val="17"/>
+              </w:rPr>
+            </w:r>
+            <w:r>
+              <w:rPr>
+                <w:rFonts w:ascii="DejaVu Sans Mono" w:hAnsi="DejaVu Sans Mono"/>
+                <w:sz w:val="17"/>
+              </w:rPr>
+              <w:t>gtkwave waves/tb_loopback.vcd waves/loopback.gtkw</w:t>
+            </w:r>
+          </w:p>
+        </w:tc>
+        <w:tc>
+          <w:tcPr>
+            <w:tcW w:type="dxa" w:w="3249"/>
+          </w:tcPr>
+          <w:p>
+            <w:r>
+              <w:rPr>
+                <w:sz w:val="17"/>
+              </w:rPr>
+            </w:r>
+            <w:r>
+              <w:rPr>
+                <w:sz w:val="17"/>
+              </w:rPr>
+              <w:t>0-27 µs, marker 12.39 µs (first rx_valid)</w:t>
+            </w:r>
+          </w:p>
+        </w:tc>
+      </w:tr>
+      <w:tr>
+        <w:tc>
+          <w:tcPr>
+            <w:tcW w:type="dxa" w:w="3249"/>
+          </w:tcPr>
+          <w:p>
+            <w:r>
+              <w:rPr>
+                <w:sz w:val="17"/>
+              </w:rPr>
+            </w:r>
+            <w:r>
+              <w:rPr>
+                <w:sz w:val="17"/>
+              </w:rPr>
+              <w:t>Parity error</w:t>
+            </w:r>
+          </w:p>
+        </w:tc>
+        <w:tc>
+          <w:tcPr>
+            <w:tcW w:type="dxa" w:w="3249"/>
+          </w:tcPr>
+          <w:p>
+            <w:r>
+              <w:rPr>
+                <w:sz w:val="17"/>
+              </w:rPr>
+            </w:r>
+            <w:r>
+              <w:rPr>
+                <w:rFonts w:ascii="DejaVu Sans Mono" w:hAnsi="DejaVu Sans Mono"/>
+                <w:sz w:val="17"/>
+              </w:rPr>
+              <w:t>gtkwave waves/tb_edge_err.vcd waves/parity_err.gtkw</w:t>
+            </w:r>
+          </w:p>
+        </w:tc>
+        <w:tc>
+          <w:tcPr>
+            <w:tcW w:type="dxa" w:w="3249"/>
+          </w:tcPr>
+          <w:p>
+            <w:r>
+              <w:rPr>
+                <w:sz w:val="17"/>
+              </w:rPr>
+            </w:r>
+            <w:r>
+              <w:rPr>
+                <w:sz w:val="17"/>
+              </w:rPr>
+              <w:t>832.51-865.80 µs, marker 846.05 µs (parity_err with rx_valid, rx_data=96)</w:t>
+            </w:r>
+          </w:p>
+        </w:tc>
+      </w:tr>
+      <w:tr>
+        <w:tc>
+          <w:tcPr>
+            <w:tcW w:type="dxa" w:w="3249"/>
+          </w:tcPr>
+          <w:p>
+            <w:r>
+              <w:rPr>
+                <w:sz w:val="17"/>
+              </w:rPr>
+            </w:r>
+            <w:r>
+              <w:rPr>
+                <w:sz w:val="17"/>
+              </w:rPr>
+              <w:t>Framing error</w:t>
+            </w:r>
+          </w:p>
+        </w:tc>
+        <w:tc>
+          <w:tcPr>
+            <w:tcW w:type="dxa" w:w="3249"/>
+          </w:tcPr>
+          <w:p>
+            <w:r>
+              <w:rPr>
+                <w:sz w:val="17"/>
+              </w:rPr>
+            </w:r>
+            <w:r>
+              <w:rPr>
+                <w:rFonts w:ascii="DejaVu Sans Mono" w:hAnsi="DejaVu Sans Mono"/>
+                <w:sz w:val="17"/>
+              </w:rPr>
+              <w:t>gtkwave waves/tb_edge_err.vcd waves/frame_err.gtkw</w:t>
+            </w:r>
+          </w:p>
+        </w:tc>
+        <w:tc>
+          <w:tcPr>
+            <w:tcW w:type="dxa" w:w="3249"/>
+          </w:tcPr>
+          <w:p>
+            <w:r>
+              <w:rPr>
+                <w:sz w:val="17"/>
+              </w:rPr>
+            </w:r>
+            <w:r>
+              <w:rPr>
+                <w:sz w:val="17"/>
+              </w:rPr>
+              <w:t>642.91-663.40 µs, marker 655.17 µs (frame_err, no rx_valid)</w:t>
+            </w:r>
+          </w:p>
+        </w:tc>
+      </w:tr>
+      <w:tr>
+        <w:tc>
+          <w:tcPr>
+            <w:tcW w:type="dxa" w:w="3249"/>
+          </w:tcPr>
+          <w:p>
+            <w:r>
+              <w:rPr>
+                <w:sz w:val="17"/>
+              </w:rPr>
+            </w:r>
+            <w:r>
+              <w:rPr>
+                <w:sz w:val="17"/>
+              </w:rPr>
+              <w:t>Low power (LOWPWR_EN=1)</w:t>
+            </w:r>
+          </w:p>
+        </w:tc>
+        <w:tc>
+          <w:tcPr>
+            <w:tcW w:type="dxa" w:w="3249"/>
+          </w:tcPr>
+          <w:p>
+            <w:r>
+              <w:rPr>
+                <w:sz w:val="17"/>
+              </w:rPr>
+            </w:r>
+            <w:r>
+              <w:rPr>
+                <w:rFonts w:ascii="DejaVu Sans Mono" w:hAnsi="DejaVu Sans Mono"/>
+                <w:sz w:val="17"/>
+              </w:rPr>
+              <w:t>gtkwave waves/power_lp1.vcd.gz waves/lowpower.gtkw</w:t>
+            </w:r>
+          </w:p>
+        </w:tc>
+        <w:tc>
+          <w:tcPr>
+            <w:tcW w:type="dxa" w:w="3249"/>
+          </w:tcPr>
+          <w:p>
+            <w:r>
+              <w:rPr>
+                <w:sz w:val="17"/>
+              </w:rPr>
+            </w:r>
+            <w:r>
+              <w:rPr>
+                <w:sz w:val="17"/>
+              </w:rPr>
+              <w:t>0-2.2 ms, marker 1995.98 µs (next frame starts)</w:t>
+            </w:r>
+          </w:p>
+        </w:tc>
+      </w:tr>
+      <w:tr>
+        <w:tc>
+          <w:tcPr>
+            <w:tcW w:type="dxa" w:w="3249"/>
+          </w:tcPr>
+          <w:p>
+            <w:r>
+              <w:rPr>
+                <w:sz w:val="17"/>
+              </w:rPr>
+            </w:r>
+            <w:r>
+              <w:rPr>
+                <w:sz w:val="17"/>
+              </w:rPr>
+              <w:t>Injected bug RXMID</w:t>
+            </w:r>
+          </w:p>
+        </w:tc>
+        <w:tc>
+          <w:tcPr>
+            <w:tcW w:type="dxa" w:w="3249"/>
+          </w:tcPr>
+          <w:p>
+            <w:r>
+              <w:rPr>
+                <w:sz w:val="17"/>
+              </w:rPr>
+            </w:r>
+            <w:r>
+              <w:rPr>
+                <w:rFonts w:ascii="DejaVu Sans Mono" w:hAnsi="DejaVu Sans Mono"/>
+                <w:sz w:val="17"/>
+              </w:rPr>
+              <w:t>gtkwave waves/tb_edge_bug_rxmid.vcd waves/bug_rxmid.gtkw</w:t>
+            </w:r>
+          </w:p>
+        </w:tc>
+        <w:tc>
+          <w:tcPr>
+            <w:tcW w:type="dxa" w:w="3249"/>
+          </w:tcPr>
+          <w:p>
+            <w:r>
+              <w:rPr>
+                <w:sz w:val="17"/>
+              </w:rPr>
+            </w:r>
+            <w:r>
+              <w:rPr>
+                <w:sz w:val="17"/>
+              </w:rPr>
+              <w:t>0-1.12 µs, marker 1.10 µs</w:t>
+            </w:r>
+          </w:p>
+        </w:tc>
+      </w:tr>
+    </w:tbl>
+    <w:p/>
+    <w:p>
+      <w:r>
+        <w:t>The injected-bug run (</w:t>
+      </w:r>
+      <w:r>
+        <w:rPr>
+          <w:rFonts w:ascii="DejaVu Sans Mono" w:hAnsi="DejaVu Sans Mono"/>
+          <w:sz w:val="18"/>
+        </w:rPr>
+        <w:t>make bug_demo</w:t>
+      </w:r>
+      <w:r>
+        <w:t xml:space="preserve">, </w:t>
+      </w:r>
+      <w:r>
+        <w:rPr>
+          <w:rFonts w:ascii="DejaVu Sans Mono" w:hAnsi="DejaVu Sans Mono"/>
+          <w:sz w:val="18"/>
+        </w:rPr>
+        <w:t>logs/bug_demo.log</w:t>
+      </w:r>
+      <w:r>
+        <w:t xml:space="preserve">) stops at 1.11 µs with </w:t>
+      </w:r>
+      <w:r>
+        <w:rPr>
+          <w:i/>
+        </w:rPr>
+        <w:t>"B2 start bit sampled at tick 11, expected 8"</w:t>
+      </w:r>
+      <w:r>
+        <w:t xml:space="preserve">. The VCD's last dumped time is 1.10 µs, so the marker is placed there. In the screenshot, </w:t>
+      </w:r>
+      <w:r>
+        <w:rPr>
+          <w:rFonts w:ascii="DejaVu Sans Mono" w:hAnsi="DejaVu Sans Mono"/>
+          <w:sz w:val="18"/>
+        </w:rPr>
+        <w:t>rx_tcnt</w:t>
+      </w:r>
+      <w:r>
+        <w:t xml:space="preserve"> is loaded with 5 instead of 8 when the start bit is detected (see </w:t>
+      </w:r>
+      <w:r>
+        <w:rPr>
+          <w:rFonts w:ascii="DejaVu Sans Mono" w:hAnsi="DejaVu Sans Mono"/>
+          <w:sz w:val="18"/>
+        </w:rPr>
+        <w:t>rtl/uart_rx.v</w:t>
+      </w:r>
+      <w:r>
+        <w:t>), which is the injected bug.</w:t>
+      </w:r>
+    </w:p>
+    <w:p>
+      <w:pPr>
+        <w:jc w:val="center"/>
+      </w:pPr>
+      <w:r>
+        <w:drawing>
+          <wp:inline xmlns:a="http://schemas.openxmlformats.org/drawingml/2006/main" xmlns:pic="http://schemas.openxmlformats.org/drawingml/2006/picture">
+            <wp:extent cx="5580000" cy="3487500"/>
+            <wp:docPr id="16" name="Picture 16"/>
+            <wp:cNvGraphicFramePr>
+              <a:graphicFrameLocks noChangeAspect="1"/>
+            </wp:cNvGraphicFramePr>
+            <a:graphic>
+              <a:graphicData uri="http://schemas.openxmlformats.org/drawingml/2006/picture">
+                <pic:pic>
+                  <pic:nvPicPr>
+                    <pic:cNvPr id="0" name="gtkwave_loopback.png"/>
+                    <pic:cNvPicPr/>
+                  </pic:nvPicPr>
+                  <pic:blipFill>
+                    <a:blip r:embed="rId24"/>
+                    <a:stretch>
+                      <a:fillRect/>
+                    </a:stretch>
+                  </pic:blipFill>
+                  <pic:spPr>
+                    <a:xfrm>
+                      <a:off x="0" y="0"/>
+                      <a:ext cx="5580000" cy="3487500"/>
+                    </a:xfrm>
+                    <a:prstGeom prst="rect"/>
+                  </pic:spPr>
+                </pic:pic>
+              </a:graphicData>
+            </a:graphic>
+          </wp:inline>
+        </w:drawing>
+      </w:r>
+    </w:p>
+    <w:p>
+      <w:pPr>
+        <w:jc w:val="center"/>
+      </w:pPr>
+      <w:r>
+        <w:rPr>
+          <w:i/>
+        </w:rPr>
+        <w:t>Figure G1: GTKWave, TX/RX loopback (tb_loopback.vcd).</w:t>
+      </w:r>
+    </w:p>
+    <w:p>
+      <w:pPr>
+        <w:jc w:val="center"/>
+      </w:pPr>
+      <w:r>
+        <w:drawing>
+          <wp:inline xmlns:a="http://schemas.openxmlformats.org/drawingml/2006/main" xmlns:pic="http://schemas.openxmlformats.org/drawingml/2006/picture">
+            <wp:extent cx="5580000" cy="3487500"/>
+            <wp:docPr id="17" name="Picture 17"/>
+            <wp:cNvGraphicFramePr>
+              <a:graphicFrameLocks noChangeAspect="1"/>
+            </wp:cNvGraphicFramePr>
+            <a:graphic>
+              <a:graphicData uri="http://schemas.openxmlformats.org/drawingml/2006/picture">
+                <pic:pic>
+                  <pic:nvPicPr>
+                    <pic:cNvPr id="0" name="gtkwave_parity_err.png"/>
+                    <pic:cNvPicPr/>
+                  </pic:nvPicPr>
+                  <pic:blipFill>
+                    <a:blip r:embed="rId25"/>
+                    <a:stretch>
+                      <a:fillRect/>
+                    </a:stretch>
+                  </pic:blipFill>
+                  <pic:spPr>
+                    <a:xfrm>
+                      <a:off x="0" y="0"/>
+                      <a:ext cx="5580000" cy="3487500"/>
+                    </a:xfrm>
+                    <a:prstGeom prst="rect"/>
+                  </pic:spPr>
+                </pic:pic>
+              </a:graphicData>
+            </a:graphic>
+          </wp:inline>
+        </w:drawing>
+      </w:r>
+    </w:p>
+    <w:p>
+      <w:pPr>
+        <w:jc w:val="center"/>
+      </w:pPr>
+      <w:r>
+        <w:rPr>
+          <w:i/>
+        </w:rPr>
+        <w:t>Figure G2: GTKWave, parity error (tb_edge_err.vcd).</w:t>
+      </w:r>
+    </w:p>
+    <w:p>
+      <w:pPr>
+        <w:jc w:val="center"/>
+      </w:pPr>
+      <w:r>
+        <w:drawing>
+          <wp:inline xmlns:a="http://schemas.openxmlformats.org/drawingml/2006/main" xmlns:pic="http://schemas.openxmlformats.org/drawingml/2006/picture">
+            <wp:extent cx="5580000" cy="3487500"/>
+            <wp:docPr id="18" name="Picture 18"/>
+            <wp:cNvGraphicFramePr>
+              <a:graphicFrameLocks noChangeAspect="1"/>
+            </wp:cNvGraphicFramePr>
+            <a:graphic>
+              <a:graphicData uri="http://schemas.openxmlformats.org/drawingml/2006/picture">
+                <pic:pic>
+                  <pic:nvPicPr>
+                    <pic:cNvPr id="0" name="gtkwave_frame_err.png"/>
+                    <pic:cNvPicPr/>
+                  </pic:nvPicPr>
+                  <pic:blipFill>
+                    <a:blip r:embed="rId26"/>
+                    <a:stretch>
+                      <a:fillRect/>
+                    </a:stretch>
+                  </pic:blipFill>
+                  <pic:spPr>
+                    <a:xfrm>
+                      <a:off x="0" y="0"/>
+                      <a:ext cx="5580000" cy="3487500"/>
+                    </a:xfrm>
+                    <a:prstGeom prst="rect"/>
+                  </pic:spPr>
+                </pic:pic>
+              </a:graphicData>
+            </a:graphic>
+          </wp:inline>
+        </w:drawing>
+      </w:r>
+    </w:p>
+    <w:p>
+      <w:pPr>
+        <w:jc w:val="center"/>
+      </w:pPr>
+      <w:r>
+        <w:rPr>
+          <w:i/>
+        </w:rPr>
+        <w:t>Figure G3: GTKWave, framing error (tb_edge_err.vcd).</w:t>
+      </w:r>
+    </w:p>
+    <w:p>
+      <w:pPr>
+        <w:jc w:val="center"/>
+      </w:pPr>
+      <w:r>
+        <w:drawing>
+          <wp:inline xmlns:a="http://schemas.openxmlformats.org/drawingml/2006/main" xmlns:pic="http://schemas.openxmlformats.org/drawingml/2006/picture">
+            <wp:extent cx="5580000" cy="3487500"/>
+            <wp:docPr id="19" name="Picture 19"/>
+            <wp:cNvGraphicFramePr>
+              <a:graphicFrameLocks noChangeAspect="1"/>
+            </wp:cNvGraphicFramePr>
+            <a:graphic>
+              <a:graphicData uri="http://schemas.openxmlformats.org/drawingml/2006/picture">
+                <pic:pic>
+                  <pic:nvPicPr>
+                    <pic:cNvPr id="0" name="gtkwave_lowpower.png"/>
+                    <pic:cNvPicPr/>
+                  </pic:nvPicPr>
+                  <pic:blipFill>
+                    <a:blip r:embed="rId27"/>
+                    <a:stretch>
+                      <a:fillRect/>
+                    </a:stretch>
+                  </pic:blipFill>
+                  <pic:spPr>
+                    <a:xfrm>
+                      <a:off x="0" y="0"/>
+                      <a:ext cx="5580000" cy="3487500"/>
+                    </a:xfrm>
+                    <a:prstGeom prst="rect"/>
+                  </pic:spPr>
+                </pic:pic>
+              </a:graphicData>
+            </a:graphic>
+          </wp:inline>
+        </w:drawing>
+      </w:r>
+    </w:p>
+    <w:p>
+      <w:pPr>
+        <w:jc w:val="center"/>
+      </w:pPr>
+      <w:r>
+        <w:rPr>
+          <w:i/>
+        </w:rPr>
+        <w:t>Figure G4: GTKWave, low-power mode: baud counters stop between frames (power_lp1.vcd.gz).</w:t>
+      </w:r>
+    </w:p>
+    <w:p>
+      <w:pPr>
+        <w:jc w:val="center"/>
+      </w:pPr>
+      <w:r>
+        <w:drawing>
+          <wp:inline xmlns:a="http://schemas.openxmlformats.org/drawingml/2006/main" xmlns:pic="http://schemas.openxmlformats.org/drawingml/2006/picture">
+            <wp:extent cx="5580000" cy="3379124"/>
+            <wp:docPr id="20" name="Picture 20"/>
+            <wp:cNvGraphicFramePr>
+              <a:graphicFrameLocks noChangeAspect="1"/>
+            </wp:cNvGraphicFramePr>
+            <a:graphic>
+              <a:graphicData uri="http://schemas.openxmlformats.org/drawingml/2006/picture">
+                <pic:pic>
+                  <pic:nvPicPr>
+                    <pic:cNvPr id="0" name="gtkwave_bug_rxmid_terminal.png"/>
+                    <pic:cNvPicPr/>
+                  </pic:nvPicPr>
+                  <pic:blipFill>
+                    <a:blip r:embed="rId28"/>
+                    <a:stretch>
+                      <a:fillRect/>
+                    </a:stretch>
+                  </pic:blipFill>
+                  <pic:spPr>
+                    <a:xfrm>
+                      <a:off x="0" y="0"/>
+                      <a:ext cx="5580000" cy="3379124"/>
+                    </a:xfrm>
+                    <a:prstGeom prst="rect"/>
+                  </pic:spPr>
+                </pic:pic>
+              </a:graphicData>
+            </a:graphic>
+          </wp:inline>
+        </w:drawing>
+      </w:r>
+    </w:p>
+    <w:p>
+      <w:pPr>
+        <w:jc w:val="center"/>
+      </w:pPr>
+      <w:r>
+        <w:rPr>
+          <w:i/>
+        </w:rPr>
+        <w:t>Figure G5: terminal running `make bug_demo`; the SVA error from B2.</w:t>
+      </w:r>
+    </w:p>
+    <w:p>
+      <w:pPr>
+        <w:jc w:val="center"/>
+      </w:pPr>
+      <w:r>
+        <w:drawing>
+          <wp:inline xmlns:a="http://schemas.openxmlformats.org/drawingml/2006/main" xmlns:pic="http://schemas.openxmlformats.org/drawingml/2006/picture">
+            <wp:extent cx="5580000" cy="3487500"/>
+            <wp:docPr id="21" name="Picture 21"/>
+            <wp:cNvGraphicFramePr>
+              <a:graphicFrameLocks noChangeAspect="1"/>
+            </wp:cNvGraphicFramePr>
+            <a:graphic>
+              <a:graphicData uri="http://schemas.openxmlformats.org/drawingml/2006/picture">
+                <pic:pic>
+                  <pic:nvPicPr>
+                    <pic:cNvPr id="0" name="gtkwave_bug_rxmid.png"/>
+                    <pic:cNvPicPr/>
+                  </pic:nvPicPr>
+                  <pic:blipFill>
+                    <a:blip r:embed="rId29"/>
+                    <a:stretch>
+                      <a:fillRect/>
+                    </a:stretch>
+                  </pic:blipFill>
+                  <pic:spPr>
+                    <a:xfrm>
+                      <a:off x="0" y="0"/>
+                      <a:ext cx="5580000" cy="3487500"/>
+                    </a:xfrm>
+                    <a:prstGeom prst="rect"/>
+                  </pic:spPr>
+                </pic:pic>
+              </a:graphicData>
+            </a:graphic>
+          </wp:inline>
+        </w:drawing>
+      </w:r>
+    </w:p>
+    <w:p>
+      <w:pPr>
+        <w:jc w:val="center"/>
+      </w:pPr>
+      <w:r>
+        <w:rPr>
+          <w:i/>
+        </w:rPr>
+        <w:t>Figure G6: GTKWave at the B2 failure (tb_edge_bug_rxmid.vcd).</w:t>
+      </w:r>
+    </w:p>
+    <w:p>
+      <w:pPr>
         <w:pStyle w:val="Heading1"/>
       </w:pPr>
       <w:r>
@@ -9152,7 +9939,7 @@
         <w:drawing>
           <wp:inline xmlns:a="http://schemas.openxmlformats.org/drawingml/2006/main" xmlns:pic="http://schemas.openxmlformats.org/drawingml/2006/picture">
             <wp:extent cx="5580000" cy="2232000"/>
-            <wp:docPr id="16" name="Picture 16"/>
+            <wp:docPr id="22" name="Picture 22"/>
             <wp:cNvGraphicFramePr>
               <a:graphicFrameLocks noChangeAspect="1"/>
             </wp:cNvGraphicFramePr>
@@ -9164,7 +9951,7 @@
                     <pic:cNvPicPr/>
                   </pic:nvPicPr>
                   <pic:blipFill>
-                    <a:blip r:embed="rId24"/>
+                    <a:blip r:embed="rId30"/>
                     <a:stretch>
                       <a:fillRect/>
                     </a:stretch>

</xml_diff>

<commit_message>
Replace GTKWave screenshots with captures from Windows laptop; captions state where each VCD was simulated; drop dark Linux set
</commit_message>
<xml_diff>
--- a/report/UART_IP_Core_Report.docx
+++ b/report/UART_IP_Core_Report.docx
@@ -7153,7 +7153,7 @@
       <w:r>
         <w:drawing>
           <wp:inline xmlns:a="http://schemas.openxmlformats.org/drawingml/2006/main" xmlns:pic="http://schemas.openxmlformats.org/drawingml/2006/picture">
-            <wp:extent cx="5580000" cy="3487500"/>
+            <wp:extent cx="5580000" cy="3146046"/>
             <wp:docPr id="16" name="Picture 16"/>
             <wp:cNvGraphicFramePr>
               <a:graphicFrameLocks noChangeAspect="1"/>
@@ -7174,7 +7174,7 @@
                   <pic:spPr>
                     <a:xfrm>
                       <a:off x="0" y="0"/>
-                      <a:ext cx="5580000" cy="3487500"/>
+                      <a:ext cx="5580000" cy="3146046"/>
                     </a:xfrm>
                     <a:prstGeom prst="rect"/>
                   </pic:spPr>
@@ -7193,7 +7193,7 @@
         <w:rPr>
           <w:i/>
         </w:rPr>
-        <w:t>Figure G1: GTKWave, TX/RX loopback (tb_loopback.vcd).</w:t>
+        <w:t>Figure G1: GTKWave on Windows 11, TX/RX loopback; simulated with Icarus Verilog 12 on Windows (tb_loopback.vcd).</w:t>
       </w:r>
     </w:p>
     <w:p>
@@ -7203,7 +7203,7 @@
       <w:r>
         <w:drawing>
           <wp:inline xmlns:a="http://schemas.openxmlformats.org/drawingml/2006/main" xmlns:pic="http://schemas.openxmlformats.org/drawingml/2006/picture">
-            <wp:extent cx="5580000" cy="3487500"/>
+            <wp:extent cx="5580000" cy="3073803"/>
             <wp:docPr id="17" name="Picture 17"/>
             <wp:cNvGraphicFramePr>
               <a:graphicFrameLocks noChangeAspect="1"/>
@@ -7224,7 +7224,7 @@
                   <pic:spPr>
                     <a:xfrm>
                       <a:off x="0" y="0"/>
-                      <a:ext cx="5580000" cy="3487500"/>
+                      <a:ext cx="5580000" cy="3073803"/>
                     </a:xfrm>
                     <a:prstGeom prst="rect"/>
                   </pic:spPr>
@@ -7243,7 +7243,7 @@
         <w:rPr>
           <w:i/>
         </w:rPr>
-        <w:t>Figure G2: GTKWave, parity error (tb_edge_err.vcd).</w:t>
+        <w:t>Figure G2: GTKWave on Windows 11, parity error (tb_edge_err.vcd, simulated with Verilator 5.032 on Linux).</w:t>
       </w:r>
     </w:p>
     <w:p>
@@ -7253,7 +7253,7 @@
       <w:r>
         <w:drawing>
           <wp:inline xmlns:a="http://schemas.openxmlformats.org/drawingml/2006/main" xmlns:pic="http://schemas.openxmlformats.org/drawingml/2006/picture">
-            <wp:extent cx="5580000" cy="3487500"/>
+            <wp:extent cx="5580000" cy="3137840"/>
             <wp:docPr id="18" name="Picture 18"/>
             <wp:cNvGraphicFramePr>
               <a:graphicFrameLocks noChangeAspect="1"/>
@@ -7274,7 +7274,7 @@
                   <pic:spPr>
                     <a:xfrm>
                       <a:off x="0" y="0"/>
-                      <a:ext cx="5580000" cy="3487500"/>
+                      <a:ext cx="5580000" cy="3137840"/>
                     </a:xfrm>
                     <a:prstGeom prst="rect"/>
                   </pic:spPr>
@@ -7293,7 +7293,7 @@
         <w:rPr>
           <w:i/>
         </w:rPr>
-        <w:t>Figure G3: GTKWave, framing error (tb_edge_err.vcd).</w:t>
+        <w:t>Figure G3: GTKWave on Windows 11, framing error (tb_edge_err.vcd, simulated with Verilator 5.032 on Linux).</w:t>
       </w:r>
     </w:p>
     <w:p>
@@ -7303,7 +7303,7 @@
       <w:r>
         <w:drawing>
           <wp:inline xmlns:a="http://schemas.openxmlformats.org/drawingml/2006/main" xmlns:pic="http://schemas.openxmlformats.org/drawingml/2006/picture">
-            <wp:extent cx="5580000" cy="3487500"/>
+            <wp:extent cx="5580000" cy="3139478"/>
             <wp:docPr id="19" name="Picture 19"/>
             <wp:cNvGraphicFramePr>
               <a:graphicFrameLocks noChangeAspect="1"/>
@@ -7324,7 +7324,7 @@
                   <pic:spPr>
                     <a:xfrm>
                       <a:off x="0" y="0"/>
-                      <a:ext cx="5580000" cy="3487500"/>
+                      <a:ext cx="5580000" cy="3139478"/>
                     </a:xfrm>
                     <a:prstGeom prst="rect"/>
                   </pic:spPr>
@@ -7343,7 +7343,7 @@
         <w:rPr>
           <w:i/>
         </w:rPr>
-        <w:t>Figure G4: GTKWave, low-power mode: baud counters stop between frames (power_lp1.vcd.gz).</w:t>
+        <w:t>Figure G4: GTKWave on Windows 11, low-power mode: baud counters stop between frames; simulated with Icarus Verilog 12 on Windows (power_lp1.vcd).</w:t>
       </w:r>
     </w:p>
     <w:p>
@@ -7403,7 +7403,7 @@
       <w:r>
         <w:drawing>
           <wp:inline xmlns:a="http://schemas.openxmlformats.org/drawingml/2006/main" xmlns:pic="http://schemas.openxmlformats.org/drawingml/2006/picture">
-            <wp:extent cx="5580000" cy="3487500"/>
+            <wp:extent cx="5580000" cy="3452646"/>
             <wp:docPr id="21" name="Picture 21"/>
             <wp:cNvGraphicFramePr>
               <a:graphicFrameLocks noChangeAspect="1"/>
@@ -7424,7 +7424,7 @@
                   <pic:spPr>
                     <a:xfrm>
                       <a:off x="0" y="0"/>
-                      <a:ext cx="5580000" cy="3487500"/>
+                      <a:ext cx="5580000" cy="3452646"/>
                     </a:xfrm>
                     <a:prstGeom prst="rect"/>
                   </pic:spPr>
@@ -7443,7 +7443,7 @@
         <w:rPr>
           <w:i/>
         </w:rPr>
-        <w:t>Figure G6: GTKWave at the B2 failure (tb_edge_bug_rxmid.vcd).</w:t>
+        <w:t>Figure G6: GTKWave on Windows 11 at the B2 failure (tb_edge_bug_rxmid.vcd, simulated with Verilator 5.032 on Linux).</w:t>
       </w:r>
     </w:p>
     <w:p>

</xml_diff>

<commit_message>
Restructure report and README to follow the DSP case study sections (title, application, problem, constraints, concepts, architecture, design, tool, results, quantitative performance, justification, limitations, improvement, conclusion); rebuild PDF
</commit_message>
<xml_diff>
--- a/report/UART_IP_Core_Report.docx
+++ b/report/UART_IP_Core_Report.docx
@@ -29,7 +29,7 @@
         <w:t>Tools:</w:t>
       </w:r>
       <w:r>
-        <w:t xml:space="preserve"> Verilator 5.032, Icarus Verilog 12, Yosys 0.52, Python/matplotlib, Graphviz</w:t>
+        <w:t xml:space="preserve"> Verilator 5.032, Icarus Verilog 12, Yosys 0.52, nextpnr-ice40, GTKWave 3.3.121, Python/matplotlib, Graphviz</w:t>
       </w:r>
     </w:p>
     <w:p>
@@ -48,12 +48,96 @@
         <w:pStyle w:val="Heading1"/>
       </w:pPr>
       <w:r>
-        <w:t>Abstract</w:t>
+        <w:t>1. Title of Problem</w:t>
       </w:r>
     </w:p>
     <w:p>
       <w:r>
-        <w:t>This report covers a UART IP core that I wrote from scratch in Verilog and verified with self-checking testbenches. The core has a runtime-programmable 16x oversampling baud generator, a transmitter with none/even/odd parity, and a receiver. The receiver has a two-flop synchronizer, mid-bit sampling, start-bit glitch rejection, and parity and framing error flags. On top of this I added four optional, parameter-enabled features:</w:t>
+        <w:t>Design and verification of a configurable UART IP core in Verilog, with optional auto-baud, SECDED error correction, a low-power mode and a line-quality monitor, checked with SVA assertions and compared by Yosys/nextpnr synthesis.</w:t>
+      </w:r>
+    </w:p>
+    <w:p>
+      <w:pPr>
+        <w:pStyle w:val="Heading1"/>
+      </w:pPr>
+      <w:r>
+        <w:t>2. Real-Life Application</w:t>
+      </w:r>
+    </w:p>
+    <w:p>
+      <w:r>
+        <w:t>Almost every microcontroller, FPGA board, GPS module and Bluetooth module has a UART, and it is usually the first link used to talk to a board (debug console, bootloader, sensor data). In practice the link has problems that a minimal UART does not handle: the two sides may not know each other's baud rate, long or noisy cables flip bits, a battery-powered device wastes power while the line sits idle, and there is no easy way to see that a link is getting worse before bytes are lost. This project builds a UART core where each of these problems is handled by a feature that can be switched on with a parameter, so a small design does not pay for features it does not use.</w:t>
+      </w:r>
+    </w:p>
+    <w:p>
+      <w:pPr>
+        <w:pStyle w:val="Heading1"/>
+      </w:pPr>
+      <w:r>
+        <w:t>3. Problem Statement</w:t>
+      </w:r>
+    </w:p>
+    <w:p>
+      <w:r>
+        <w:t>Design a UART transmitter and receiver in synthesizable Verilog with a runtime-programmable baud rate and none/even/odd parity, and add four optional features: auto-baud detection from a 0x55 sync character (</w:t>
+      </w:r>
+      <w:r>
+        <w:rPr>
+          <w:rFonts w:ascii="DejaVu Sans Mono" w:hAnsi="DejaVu Sans Mono"/>
+          <w:sz w:val="18"/>
+        </w:rPr>
+        <w:t>AUTOBAUD_EN</w:t>
+      </w:r>
+      <w:r>
+        <w:t>), Hamming SECDED(13,8) protection (</w:t>
+      </w:r>
+      <w:r>
+        <w:rPr>
+          <w:rFonts w:ascii="DejaVu Sans Mono" w:hAnsi="DejaVu Sans Mono"/>
+          <w:sz w:val="18"/>
+        </w:rPr>
+        <w:t>ECC_EN</w:t>
+      </w:r>
+      <w:r>
+        <w:t>), clock-enable based low-power idle (</w:t>
+      </w:r>
+      <w:r>
+        <w:rPr>
+          <w:rFonts w:ascii="DejaVu Sans Mono" w:hAnsi="DejaVu Sans Mono"/>
+          <w:sz w:val="18"/>
+        </w:rPr>
+        <w:t>LOWPWR_EN</w:t>
+      </w:r>
+      <w:r>
+        <w:t>) and a line-quality monitor (</w:t>
+      </w:r>
+      <w:r>
+        <w:rPr>
+          <w:rFonts w:ascii="DejaVu Sans Mono" w:hAnsi="DejaVu Sans Mono"/>
+          <w:sz w:val="18"/>
+        </w:rPr>
+        <w:t>LINEMON_EN</w:t>
+      </w:r>
+      <w:r>
+        <w:t xml:space="preserve">). The core has to be verified with self-checking testbenches and SVA assertions, the assertions themselves have to be shown to fail on injected bugs, and the cost of each feature has to be measured with synthesis. There is no FPGA board in this project, so all results come from simulation and synthesis tools, and every number in this report is copied from a log in </w:t>
+      </w:r>
+      <w:r>
+        <w:rPr>
+          <w:rFonts w:ascii="DejaVu Sans Mono" w:hAnsi="DejaVu Sans Mono"/>
+          <w:sz w:val="18"/>
+        </w:rPr>
+        <w:t>logs/</w:t>
+      </w:r>
+      <w:r>
+        <w:t>.</w:t>
+      </w:r>
+    </w:p>
+    <w:p>
+      <w:pPr>
+        <w:pStyle w:val="Heading1"/>
+      </w:pPr>
+      <w:r>
+        <w:t>4. Engineering Constraints</w:t>
       </w:r>
     </w:p>
     <w:p>
@@ -61,7 +145,13 @@
         <w:pStyle w:val="ListBullet"/>
       </w:pPr>
       <w:r>
-        <w:t>auto-baud detection from a 0x55 sync character;</w:t>
+        <w:rPr>
+          <w:b/>
+        </w:rPr>
+        <w:t>Frame format:</w:t>
+      </w:r>
+      <w:r>
+        <w:t xml:space="preserve"> 1 start bit, 8 data bits (LSB first), optional parity bit, 1 stop bit; line idles high.</w:t>
       </w:r>
     </w:p>
     <w:p>
@@ -69,7 +159,33 @@
         <w:pStyle w:val="ListBullet"/>
       </w:pPr>
       <w:r>
-        <w:t>Hamming SECDED(13,8) protection spread over two frames;</w:t>
+        <w:rPr>
+          <w:b/>
+        </w:rPr>
+        <w:t>Clock and baud:</w:t>
+      </w:r>
+      <w:r>
+        <w:t xml:space="preserve"> tested at 50, 100 and 133.3 MHz system clock and 2400 to 921600 baud. The tick is 16x the baud rate, so </w:t>
+      </w:r>
+      <w:r>
+        <w:rPr>
+          <w:rFonts w:ascii="DejaVu Sans Mono" w:hAnsi="DejaVu Sans Mono"/>
+          <w:sz w:val="18"/>
+        </w:rPr>
+        <w:t>divisor = f_clk / (16 * baud)</w:t>
+      </w:r>
+      <w:r>
+        <w:t>; divisors 1 to 65535 were tested (</w:t>
+      </w:r>
+      <w:r>
+        <w:rPr>
+          <w:rFonts w:ascii="DejaVu Sans Mono" w:hAnsi="DejaVu Sans Mono"/>
+          <w:sz w:val="18"/>
+        </w:rPr>
+        <w:t>DIV_W=16</w:t>
+      </w:r>
+      <w:r>
+        <w:t>).</w:t>
       </w:r>
     </w:p>
     <w:p>
@@ -77,7 +193,13 @@
         <w:pStyle w:val="ListBullet"/>
       </w:pPr>
       <w:r>
-        <w:t>a low-power mode that clock-enables the baud counters and wakes on a start edge;</w:t>
+        <w:rPr>
+          <w:b/>
+        </w:rPr>
+        <w:t>Baud tolerance:</w:t>
+      </w:r>
+      <w:r>
+        <w:t xml:space="preserve"> the receiver has to accept ±2% and ±3% baud mismatch with no bad frames (measured: 0 bad frames in 500 frames each, all three seeds).</w:t>
       </w:r>
     </w:p>
     <w:p>
@@ -85,32 +207,89 @@
         <w:pStyle w:val="ListBullet"/>
       </w:pPr>
       <w:r>
-        <w:t>a line-quality monitor with error counters, bit-timing drift and a 0-100 health score.</w:t>
-      </w:r>
-    </w:p>
-    <w:p>
-      <w:r>
-        <w:t xml:space="preserve">Verification uses directed and randomized SystemVerilog testbenches with fixed seeds, a scoreboard, and 12 SVA properties checked by Verilator with </w:t>
+        <w:rPr>
+          <w:b/>
+        </w:rPr>
+        <w:t>Asynchronous input:</w:t>
+      </w:r>
+      <w:r>
+        <w:t xml:space="preserve"> </w:t>
       </w:r>
       <w:r>
         <w:rPr>
           <w:rFonts w:ascii="DejaVu Sans Mono" w:hAnsi="DejaVu Sans Mono"/>
           <w:sz w:val="18"/>
         </w:rPr>
-        <w:t>--assert</w:t>
-      </w:r>
-      <w:r>
-        <w:t xml:space="preserve">. Two deliberately injected RTL bugs are caught by the assertions. Every test listed in this report passed, and the logs are in </w:t>
+        <w:t>rx</w:t>
+      </w:r>
+      <w:r>
+        <w:t xml:space="preserve"> is not synchronous to </w:t>
       </w:r>
       <w:r>
         <w:rPr>
           <w:rFonts w:ascii="DejaVu Sans Mono" w:hAnsi="DejaVu Sans Mono"/>
           <w:sz w:val="18"/>
         </w:rPr>
-        <w:t>logs/</w:t>
-      </w:r>
-      <w:r>
-        <w:t>. Yosys gives cell counts and logic depth for eight parameter configurations. Every number here comes from a log file in the project. Nothing is estimated.</w:t>
+        <w:t>clk</w:t>
+      </w:r>
+      <w:r>
+        <w:t>, so it needs a synchronizer before any logic.</w:t>
+      </w:r>
+    </w:p>
+    <w:p>
+      <w:pPr>
+        <w:pStyle w:val="ListBullet"/>
+      </w:pPr>
+      <w:r>
+        <w:rPr>
+          <w:b/>
+        </w:rPr>
+        <w:t>Area:</w:t>
+      </w:r>
+      <w:r>
+        <w:t xml:space="preserve"> a disabled feature must not be synthesized at all.</w:t>
+      </w:r>
+    </w:p>
+    <w:p>
+      <w:pPr>
+        <w:pStyle w:val="ListBullet"/>
+      </w:pPr>
+      <w:r>
+        <w:rPr>
+          <w:b/>
+        </w:rPr>
+        <w:t>Timing:</w:t>
+      </w:r>
+      <w:r>
+        <w:t xml:space="preserve"> no fixed Fmax target was given. Fmax is reported from nextpnr-ice40 for iCE40 HX8K as an estimate.</w:t>
+      </w:r>
+    </w:p>
+    <w:p>
+      <w:pPr>
+        <w:pStyle w:val="ListBullet"/>
+      </w:pPr>
+      <w:r>
+        <w:rPr>
+          <w:b/>
+        </w:rPr>
+        <w:t>Accuracy requirement:</w:t>
+      </w:r>
+      <w:r>
+        <w:t xml:space="preserve"> every self-checking test must end with 0 errors, and every injected bug must be caught by an assertion.</w:t>
+      </w:r>
+    </w:p>
+    <w:p>
+      <w:pPr>
+        <w:pStyle w:val="ListBullet"/>
+      </w:pPr>
+      <w:r>
+        <w:rPr>
+          <w:b/>
+        </w:rPr>
+        <w:t>Hardware/software limitation:</w:t>
+      </w:r>
+      <w:r>
+        <w:t xml:space="preserve"> no FPGA board, so there is no hardware test. Verilator tests ran on Linux (the box and GitHub Actions, Ubuntu 24.04); the Icarus tests and GTKWave were also run on my Windows 11 laptop. No ASIC cell library, so no real area or power numbers.</w:t>
       </w:r>
     </w:p>
     <w:p>
@@ -118,82 +297,175 @@
         <w:pStyle w:val="Heading1"/>
       </w:pPr>
       <w:r>
-        <w:t>1. Introduction to UART</w:t>
+        <w:t>5. RTL / Verification Concepts Required</w:t>
       </w:r>
     </w:p>
     <w:p>
       <w:r>
-        <w:t>A UART sends bytes serially without a shared clock. Both sides agree on a baud rate in advance. The line idles high, and each frame looks like this:</w:t>
+        <w:t>☑ Finite state machines (TX, RX, auto-baud)</w:t>
+      </w:r>
+    </w:p>
+    <w:p>
+      <w:r>
+        <w:t>☑ 16x oversampling and mid-bit sampling</w:t>
+      </w:r>
+    </w:p>
+    <w:p>
+      <w:r>
+        <w:t>☑ Two-flop synchronizer for an asynchronous input</w:t>
+      </w:r>
+    </w:p>
+    <w:p>
+      <w:r>
+        <w:t>☑ Parity and Hamming SECDED coding</w:t>
+      </w:r>
+    </w:p>
+    <w:p>
+      <w:r>
+        <w:t>☑ Clock-enable based low-power design</w:t>
+      </w:r>
+    </w:p>
+    <w:p>
+      <w:r>
+        <w:t>☑ Parameterized RTL with generate blocks</w:t>
+      </w:r>
+    </w:p>
+    <w:p>
+      <w:r>
+        <w:t>☑ Self-checking testbenches with a scoreboard</w:t>
+      </w:r>
+    </w:p>
+    <w:p>
+      <w:r>
+        <w:t>☑ Seeded randomized stimulus</w:t>
+      </w:r>
+    </w:p>
+    <w:p>
+      <w:r>
+        <w:t>☑ SystemVerilog Assertions (SVA), including negative tests</w:t>
+      </w:r>
+    </w:p>
+    <w:p>
+      <w:r>
+        <w:t>☑ Logic synthesis and FPGA place and route</w:t>
+      </w:r>
+    </w:p>
+    <w:p>
+      <w:r>
+        <w:t>☐ Formal verification</w:t>
+      </w:r>
+    </w:p>
+    <w:p>
+      <w:r>
+        <w:t>☐ Functional coverage (covergroups)</w:t>
+      </w:r>
+    </w:p>
+    <w:p>
+      <w:r>
+        <w:t>☐ Gate-level simulation</w:t>
+      </w:r>
+    </w:p>
+    <w:p>
+      <w:r>
+        <w:t>☐ Other: __________</w:t>
       </w:r>
     </w:p>
     <w:p>
       <w:pPr>
-        <w:pStyle w:val="ListBullet"/>
+        <w:pStyle w:val="Heading1"/>
       </w:pPr>
       <w:r>
-        <w:t xml:space="preserve">one </w:t>
-      </w:r>
-      <w:r>
-        <w:rPr>
-          <w:b/>
-        </w:rPr>
-        <w:t>start bit</w:t>
-      </w:r>
-      <w:r>
-        <w:t xml:space="preserve"> (0);</w:t>
+        <w:t>6. Proposed Architecture</w:t>
       </w:r>
     </w:p>
     <w:p>
-      <w:pPr>
-        <w:pStyle w:val="ListBullet"/>
-      </w:pPr>
-      <w:r>
-        <w:rPr>
-          <w:b/>
-        </w:rPr>
-        <w:t>8 data bits</w:t>
-      </w:r>
-      <w:r>
-        <w:t>, LSB first;</w:t>
+      <w:r>
+        <w:t>Input → Synchronization → Oversampling → FSM → Output</w:t>
       </w:r>
     </w:p>
     <w:p>
-      <w:pPr>
-        <w:pStyle w:val="ListBullet"/>
-      </w:pPr>
-      <w:r>
-        <w:t xml:space="preserve">an optional </w:t>
+      <w:r>
+        <w:t xml:space="preserve">Implemented chain: </w:t>
       </w:r>
       <w:r>
         <w:rPr>
-          <w:b/>
+          <w:rFonts w:ascii="DejaVu Sans Mono" w:hAnsi="DejaVu Sans Mono"/>
+          <w:sz w:val="18"/>
         </w:rPr>
-        <w:t>parity bit</w:t>
-      </w:r>
-      <w:r>
-        <w:t xml:space="preserve"> (even or odd);</w:t>
-      </w:r>
-    </w:p>
-    <w:p>
-      <w:pPr>
-        <w:pStyle w:val="ListBullet"/>
-      </w:pPr>
-      <w:r>
-        <w:t xml:space="preserve">one </w:t>
+        <w:t>tx_start</w:t>
+      </w:r>
+      <w:r>
+        <w:t>/</w:t>
       </w:r>
       <w:r>
         <w:rPr>
-          <w:b/>
+          <w:rFonts w:ascii="DejaVu Sans Mono" w:hAnsi="DejaVu Sans Mono"/>
+          <w:sz w:val="18"/>
         </w:rPr>
-        <w:t>stop bit</w:t>
-      </w:r>
-      <w:r>
-        <w:t xml:space="preserve"> (1).</w:t>
-      </w:r>
-    </w:p>
-    <w:p>
-      <w:r>
-        <w:t>The receiver detects the falling edge of the start bit. It then samples each bit near its middle, which leaves about ±50% of a bit of timing margin. Across a whole frame this works out to roughly ±4-5% total baud mismatch. In practice the safe figure is quoted as ±2% per side.</w:t>
+        <w:t>tx_data</w:t>
+      </w:r>
+      <w:r>
+        <w:t xml:space="preserve"> → [optional SECDED encoder, two frames] → TX baud generator + TX FSM → </w:t>
+      </w:r>
+      <w:r>
+        <w:rPr>
+          <w:rFonts w:ascii="DejaVu Sans Mono" w:hAnsi="DejaVu Sans Mono"/>
+          <w:sz w:val="18"/>
+        </w:rPr>
+        <w:t>tx</w:t>
+      </w:r>
+      <w:r>
+        <w:t xml:space="preserve"> line → </w:t>
+      </w:r>
+      <w:r>
+        <w:rPr>
+          <w:rFonts w:ascii="DejaVu Sans Mono" w:hAnsi="DejaVu Sans Mono"/>
+          <w:sz w:val="18"/>
+        </w:rPr>
+        <w:t>rx</w:t>
+      </w:r>
+      <w:r>
+        <w:t xml:space="preserve"> line → 2-flop synchronizer → [optional auto-baud measures 0x55 and sets the divisor] → RX baud generator + RX FSM (mid-bit sampling) → [optional SECDED decoder] → </w:t>
+      </w:r>
+      <w:r>
+        <w:rPr>
+          <w:rFonts w:ascii="DejaVu Sans Mono" w:hAnsi="DejaVu Sans Mono"/>
+          <w:sz w:val="18"/>
+        </w:rPr>
+        <w:t>rx_data</w:t>
+      </w:r>
+      <w:r>
+        <w:t>/</w:t>
+      </w:r>
+      <w:r>
+        <w:rPr>
+          <w:rFonts w:ascii="DejaVu Sans Mono" w:hAnsi="DejaVu Sans Mono"/>
+          <w:sz w:val="18"/>
+        </w:rPr>
+        <w:t>rx_valid</w:t>
+      </w:r>
+      <w:r>
+        <w:t xml:space="preserve">, </w:t>
+      </w:r>
+      <w:r>
+        <w:rPr>
+          <w:rFonts w:ascii="DejaVu Sans Mono" w:hAnsi="DejaVu Sans Mono"/>
+          <w:sz w:val="18"/>
+        </w:rPr>
+        <w:t>parity_err</w:t>
+      </w:r>
+      <w:r>
+        <w:t xml:space="preserve">, </w:t>
+      </w:r>
+      <w:r>
+        <w:rPr>
+          <w:rFonts w:ascii="DejaVu Sans Mono" w:hAnsi="DejaVu Sans Mono"/>
+          <w:sz w:val="18"/>
+        </w:rPr>
+        <w:t>frame_err</w:t>
+      </w:r>
+      <w:r>
+        <w:t>, with the optional line monitor watching the RX outputs.</w:t>
       </w:r>
     </w:p>
     <w:p>
@@ -203,8 +475,73 @@
       <w:r>
         <w:drawing>
           <wp:inline xmlns:a="http://schemas.openxmlformats.org/drawingml/2006/main" xmlns:pic="http://schemas.openxmlformats.org/drawingml/2006/picture">
+            <wp:extent cx="5580000" cy="919630"/>
+            <wp:docPr id="1" name="Picture 1"/>
+            <wp:cNvGraphicFramePr>
+              <a:graphicFrameLocks noChangeAspect="1"/>
+            </wp:cNvGraphicFramePr>
+            <a:graphic>
+              <a:graphicData uri="http://schemas.openxmlformats.org/drawingml/2006/picture">
+                <pic:pic>
+                  <pic:nvPicPr>
+                    <pic:cNvPr id="0" name="block.png"/>
+                    <pic:cNvPicPr/>
+                  </pic:nvPicPr>
+                  <pic:blipFill>
+                    <a:blip r:embed="rId9"/>
+                    <a:stretch>
+                      <a:fillRect/>
+                    </a:stretch>
+                  </pic:blipFill>
+                  <pic:spPr>
+                    <a:xfrm>
+                      <a:off x="0" y="0"/>
+                      <a:ext cx="5580000" cy="919630"/>
+                    </a:xfrm>
+                    <a:prstGeom prst="rect"/>
+                  </pic:spPr>
+                </pic:pic>
+              </a:graphicData>
+            </a:graphic>
+          </wp:inline>
+        </w:drawing>
+      </w:r>
+    </w:p>
+    <w:p>
+      <w:pPr>
+        <w:jc w:val="center"/>
+      </w:pPr>
+      <w:r>
+        <w:rPr>
+          <w:i/>
+        </w:rPr>
+        <w:t>Figure 1: Top-level block diagram of `uart_core` (generated with Graphviz from report/figs/block.dot).</w:t>
+      </w:r>
+    </w:p>
+    <w:p>
+      <w:r>
+        <w:t xml:space="preserve">The TX and RX have separate baud generators. This lets the low-power mode stop one without the other, and it lets the receiver re-phase its counter on every start bit. Each optional block sits in a </w:t>
+      </w:r>
+      <w:r>
+        <w:rPr>
+          <w:rFonts w:ascii="DejaVu Sans Mono" w:hAnsi="DejaVu Sans Mono"/>
+          <w:sz w:val="18"/>
+        </w:rPr>
+        <w:t>generate if (X != 0)</w:t>
+      </w:r>
+      <w:r>
+        <w:t xml:space="preserve"> section, so a disabled feature is not elaborated.</w:t>
+      </w:r>
+    </w:p>
+    <w:p>
+      <w:pPr>
+        <w:jc w:val="center"/>
+      </w:pPr>
+      <w:r>
+        <w:drawing>
+          <wp:inline xmlns:a="http://schemas.openxmlformats.org/drawingml/2006/main" xmlns:pic="http://schemas.openxmlformats.org/drawingml/2006/picture">
             <wp:extent cx="5580000" cy="1227600"/>
-            <wp:docPr id="1" name="Picture 1"/>
+            <wp:docPr id="2" name="Picture 2"/>
             <wp:cNvGraphicFramePr>
               <a:graphicFrameLocks noChangeAspect="1"/>
             </wp:cNvGraphicFramePr>
@@ -216,7 +553,7 @@
                     <pic:cNvPicPr/>
                   </pic:nvPicPr>
                   <pic:blipFill>
-                    <a:blip r:embed="rId9"/>
+                    <a:blip r:embed="rId10"/>
                     <a:stretch>
                       <a:fillRect/>
                     </a:stretch>
@@ -243,80 +580,7 @@
         <w:rPr>
           <w:i/>
         </w:rPr>
-        <w:t>Figure 1: Frame format (0xA5, 8E1) with the mid-bit sample points used by my receiver.</w:t>
-      </w:r>
-    </w:p>
-    <w:p>
-      <w:pPr>
-        <w:pStyle w:val="Heading1"/>
-      </w:pPr>
-      <w:r>
-        <w:t>2. Architecture</w:t>
-      </w:r>
-    </w:p>
-    <w:p>
-      <w:pPr>
-        <w:jc w:val="center"/>
-      </w:pPr>
-      <w:r>
-        <w:drawing>
-          <wp:inline xmlns:a="http://schemas.openxmlformats.org/drawingml/2006/main" xmlns:pic="http://schemas.openxmlformats.org/drawingml/2006/picture">
-            <wp:extent cx="5580000" cy="919630"/>
-            <wp:docPr id="2" name="Picture 2"/>
-            <wp:cNvGraphicFramePr>
-              <a:graphicFrameLocks noChangeAspect="1"/>
-            </wp:cNvGraphicFramePr>
-            <a:graphic>
-              <a:graphicData uri="http://schemas.openxmlformats.org/drawingml/2006/picture">
-                <pic:pic>
-                  <pic:nvPicPr>
-                    <pic:cNvPr id="0" name="block.png"/>
-                    <pic:cNvPicPr/>
-                  </pic:nvPicPr>
-                  <pic:blipFill>
-                    <a:blip r:embed="rId10"/>
-                    <a:stretch>
-                      <a:fillRect/>
-                    </a:stretch>
-                  </pic:blipFill>
-                  <pic:spPr>
-                    <a:xfrm>
-                      <a:off x="0" y="0"/>
-                      <a:ext cx="5580000" cy="919630"/>
-                    </a:xfrm>
-                    <a:prstGeom prst="rect"/>
-                  </pic:spPr>
-                </pic:pic>
-              </a:graphicData>
-            </a:graphic>
-          </wp:inline>
-        </w:drawing>
-      </w:r>
-    </w:p>
-    <w:p>
-      <w:pPr>
-        <w:jc w:val="center"/>
-      </w:pPr>
-      <w:r>
-        <w:rPr>
-          <w:i/>
-        </w:rPr>
-        <w:t>Figure 2: Top-level block diagram of `uart_core` (generated with Graphviz from report/figs/block.dot).</w:t>
-      </w:r>
-    </w:p>
-    <w:p>
-      <w:r>
-        <w:t xml:space="preserve">The TX and RX have separate baud generators. This lets the low-power mode stop one without the other, and it lets the receiver re-phase its counter on every start bit. Each optional block sits in a </w:t>
-      </w:r>
-      <w:r>
-        <w:rPr>
-          <w:rFonts w:ascii="DejaVu Sans Mono" w:hAnsi="DejaVu Sans Mono"/>
-          <w:sz w:val="18"/>
-        </w:rPr>
-        <w:t>generate if (X != 0)</w:t>
-      </w:r>
-      <w:r>
-        <w:t xml:space="preserve"> section. When a feature is off, its logic is not elaborated at all, which section 7 confirms.</w:t>
+        <w:t>Figure 2: Frame format (0xA5, 8E1) with the mid-bit sample points used by my receiver.</w:t>
       </w:r>
     </w:p>
     <w:p>
@@ -324,7 +588,7 @@
         <w:pStyle w:val="Heading2"/>
       </w:pPr>
       <w:r>
-        <w:t>2.1 Parameters and interface</w:t>
+        <w:t>6.1 Parameters and interface</w:t>
       </w:r>
     </w:p>
     <w:tbl>
@@ -1490,7 +1754,7 @@
         <w:pStyle w:val="Heading1"/>
       </w:pPr>
       <w:r>
-        <w:t>3. Module design</w:t>
+        <w:t>7. Design/Algorithm</w:t>
       </w:r>
     </w:p>
     <w:p>
@@ -1498,7 +1762,7 @@
         <w:pStyle w:val="Heading2"/>
       </w:pPr>
       <w:r>
-        <w:t>3.1 Baud generator (`uart_baud_gen.v`)</w:t>
+        <w:t>Step 1 – Baud generator (`uart_baud_gen.v`)</w:t>
       </w:r>
     </w:p>
     <w:p>
@@ -1617,7 +1881,7 @@
         <w:pStyle w:val="Heading2"/>
       </w:pPr>
       <w:r>
-        <w:t>3.2 Transmitter (`uart_tx.v`)</w:t>
+        <w:t>Step 2 – Transmitter (`uart_tx.v`)</w:t>
       </w:r>
     </w:p>
     <w:p>
@@ -1720,7 +1984,7 @@
         <w:pStyle w:val="Heading2"/>
       </w:pPr>
       <w:r>
-        <w:t>3.3 Receiver (`uart_rx.v`)</w:t>
+        <w:t>Step 3 – Receiver (`uart_rx.v`)</w:t>
       </w:r>
     </w:p>
     <w:p>
@@ -1914,7 +2178,7 @@
         <w:pStyle w:val="Heading2"/>
       </w:pPr>
       <w:r>
-        <w:t>3.4 Auto-baud (`uart_autobaud.v`)</w:t>
+        <w:t>Step 4 – Auto-baud (`uart_autobaud.v`)</w:t>
       </w:r>
     </w:p>
     <w:p>
@@ -1997,7 +2261,7 @@
         <w:pStyle w:val="Heading2"/>
       </w:pPr>
       <w:r>
-        <w:t>3.5 SECDED(13,8) (`uart_secded_enc/dec`, `uart_ecc_tx/rx`)</w:t>
+        <w:t>Step 5 – SECDED(13,8) (`uart_secded_enc/dec`, `uart_ecc_tx/rx`)</w:t>
       </w:r>
     </w:p>
     <w:p>
@@ -2108,7 +2372,7 @@
         <w:pStyle w:val="Heading2"/>
       </w:pPr>
       <w:r>
-        <w:t>3.6 Low-power mode</w:t>
+        <w:t>Step 6 – Low-power mode</w:t>
       </w:r>
     </w:p>
     <w:p>
@@ -2164,7 +2428,7 @@
         <w:pStyle w:val="Heading2"/>
       </w:pPr>
       <w:r>
-        <w:t>3.7 Line monitor (`uart_linemon.v`)</w:t>
+        <w:t>Step 7 – Line monitor (`uart_linemon.v`)</w:t>
       </w:r>
     </w:p>
     <w:p>
@@ -2208,10 +2472,10 @@
     </w:p>
     <w:p>
       <w:pPr>
-        <w:pStyle w:val="Heading1"/>
+        <w:pStyle w:val="Heading2"/>
       </w:pPr>
       <w:r>
-        <w:t>4. Verification plan</w:t>
+        <w:t>Step 8 – Verification plan</w:t>
       </w:r>
     </w:p>
     <w:p>
@@ -2840,7 +3104,85 @@
         <w:pStyle w:val="Heading1"/>
       </w:pPr>
       <w:r>
-        <w:t>5. Results</w:t>
+        <w:t>8. Implementation Tool</w:t>
+      </w:r>
+    </w:p>
+    <w:p>
+      <w:r>
+        <w:t>Verilog / SystemVerilog / FPGA / Other</w:t>
+      </w:r>
+    </w:p>
+    <w:p>
+      <w:r>
+        <w:t>Selected: Verilog-2005 RTL and SystemVerilog testbenches and assertions. Icarus Verilog 12 for the small directed tests (</w:t>
+      </w:r>
+      <w:r>
+        <w:rPr>
+          <w:rFonts w:ascii="DejaVu Sans Mono" w:hAnsi="DejaVu Sans Mono"/>
+          <w:sz w:val="18"/>
+        </w:rPr>
+        <w:t>tb_baud</w:t>
+      </w:r>
+      <w:r>
+        <w:t xml:space="preserve">, </w:t>
+      </w:r>
+      <w:r>
+        <w:rPr>
+          <w:rFonts w:ascii="DejaVu Sans Mono" w:hAnsi="DejaVu Sans Mono"/>
+          <w:sz w:val="18"/>
+        </w:rPr>
+        <w:t>tb_loopback</w:t>
+      </w:r>
+      <w:r>
+        <w:t xml:space="preserve">, </w:t>
+      </w:r>
+      <w:r>
+        <w:rPr>
+          <w:rFonts w:ascii="DejaVu Sans Mono" w:hAnsi="DejaVu Sans Mono"/>
+          <w:sz w:val="18"/>
+        </w:rPr>
+        <w:t>tb_power</w:t>
+      </w:r>
+      <w:r>
+        <w:t xml:space="preserve">); Verilator 5.032 with </w:t>
+      </w:r>
+      <w:r>
+        <w:rPr>
+          <w:rFonts w:ascii="DejaVu Sans Mono" w:hAnsi="DejaVu Sans Mono"/>
+          <w:sz w:val="18"/>
+        </w:rPr>
+        <w:t>--assert</w:t>
+      </w:r>
+      <w:r>
+        <w:t xml:space="preserve"> for the randomized, feature and edge-case testbenches and all SVA; Yosys 0.52 for generic and iCE40 synthesis; nextpnr-ice40 for place and route and the Fmax estimate; GTKWave 3.3.121 for viewing waveforms; Python/matplotlib for plots and the toggle counter. Everything runs from the </w:t>
+      </w:r>
+      <w:r>
+        <w:rPr>
+          <w:rFonts w:ascii="DejaVu Sans Mono" w:hAnsi="DejaVu Sans Mono"/>
+          <w:sz w:val="18"/>
+        </w:rPr>
+        <w:t>Makefile</w:t>
+      </w:r>
+      <w:r>
+        <w:t xml:space="preserve"> (</w:t>
+      </w:r>
+      <w:r>
+        <w:rPr>
+          <w:rFonts w:ascii="DejaVu Sans Mono" w:hAnsi="DejaVu Sans Mono"/>
+          <w:sz w:val="18"/>
+        </w:rPr>
+        <w:t>make all</w:t>
+      </w:r>
+      <w:r>
+        <w:t>), and GitHub Actions runs the same targets on every push.</w:t>
+      </w:r>
+    </w:p>
+    <w:p>
+      <w:pPr>
+        <w:pStyle w:val="Heading1"/>
+      </w:pPr>
+      <w:r>
+        <w:t>9. Results</w:t>
       </w:r>
     </w:p>
     <w:p>
@@ -2848,7 +3190,7 @@
         <w:pStyle w:val="Heading2"/>
       </w:pPr>
       <w:r>
-        <w:t>5.1 Baud generator and loopback</w:t>
+        <w:t>9.1 Baud generator and loopback</w:t>
       </w:r>
     </w:p>
     <w:p>
@@ -3036,7 +3378,7 @@
         <w:pStyle w:val="Heading2"/>
       </w:pPr>
       <w:r>
-        <w:t>5.2 Randomized testbench (tb_uart_rand.sv, DIV=16, 50 MHz)</w:t>
+        <w:t>9.2 Randomized testbench (tb_uart_rand.sv, DIV=16, 50 MHz)</w:t>
       </w:r>
     </w:p>
     <w:tbl>
@@ -3904,7 +4246,7 @@
         <w:pStyle w:val="Heading2"/>
       </w:pPr>
       <w:r>
-        <w:t>5.3 Auto-baud (F1)</w:t>
+        <w:t>9.3 Auto-baud (F1)</w:t>
       </w:r>
     </w:p>
     <w:p>
@@ -4880,7 +5222,7 @@
         <w:pStyle w:val="Heading2"/>
       </w:pPr>
       <w:r>
-        <w:t>5.4 SECDED (F2)</w:t>
+        <w:t>9.4 SECDED (F2)</w:t>
       </w:r>
     </w:p>
     <w:p>
@@ -5291,7 +5633,7 @@
         <w:pStyle w:val="Heading2"/>
       </w:pPr>
       <w:r>
-        <w:t>5.5 Low power (F3): toggle-count proxy</w:t>
+        <w:t>9.5 Low power (F3): toggle-count proxy</w:t>
       </w:r>
     </w:p>
     <w:p>
@@ -5679,7 +6021,7 @@
         <w:pStyle w:val="Heading2"/>
       </w:pPr>
       <w:r>
-        <w:t>5.6 Line monitor (F4), seed 1, 50 MHz</w:t>
+        <w:t>9.6 Line monitor (F4), seed 1, 50 MHz</w:t>
       </w:r>
     </w:p>
     <w:tbl>
@@ -6361,7 +6703,7 @@
         <w:pStyle w:val="Heading2"/>
       </w:pPr>
       <w:r>
-        <w:t>5.7 Edge-case testbench (tb_edge.sv)</w:t>
+        <w:t>9.7 Edge-case testbench (tb_edge.sv)</w:t>
       </w:r>
     </w:p>
     <w:p>
@@ -6664,7 +7006,7 @@
         <w:pStyle w:val="Heading2"/>
       </w:pPr>
       <w:r>
-        <w:t>5.8 GTKWave screenshots</w:t>
+        <w:t>9.8 GTKWave screenshots</w:t>
       </w:r>
     </w:p>
     <w:p>
@@ -7448,10 +7790,10 @@
     </w:p>
     <w:p>
       <w:pPr>
-        <w:pStyle w:val="Heading1"/>
+        <w:pStyle w:val="Heading2"/>
       </w:pPr>
       <w:r>
-        <w:t>6. Assertions (SVA)</w:t>
+        <w:t>9.9 Assertions (SVA)</w:t>
       </w:r>
     </w:p>
     <w:p>
@@ -8648,12 +8990,723 @@
         <w:pStyle w:val="Heading1"/>
       </w:pPr>
       <w:r>
-        <w:t>7. Synthesis (Yosys 0.52, nextpnr-ice40)</w:t>
+        <w:t>10. Quantitative Performance</w:t>
+      </w:r>
+    </w:p>
+    <w:tbl>
+      <w:tblPr>
+        <w:tblStyle w:val="TableGrid"/>
+        <w:tblW w:type="auto" w:w="0"/>
+        <w:tblLook w:firstColumn="1" w:firstRow="1" w:lastColumn="0" w:lastRow="0" w:noHBand="0" w:noVBand="1" w:val="04A0"/>
+      </w:tblPr>
+      <w:tblGrid>
+        <w:gridCol w:w="3249"/>
+        <w:gridCol w:w="3249"/>
+        <w:gridCol w:w="3249"/>
+      </w:tblGrid>
+      <w:tr>
+        <w:tc>
+          <w:tcPr>
+            <w:tcW w:type="dxa" w:w="3249"/>
+          </w:tcPr>
+          <w:p>
+            <w:r>
+              <w:rPr>
+                <w:b/>
+                <w:sz w:val="17"/>
+              </w:rPr>
+            </w:r>
+            <w:r>
+              <w:rPr>
+                <w:b/>
+                <w:sz w:val="17"/>
+              </w:rPr>
+              <w:t>Parameter</w:t>
+            </w:r>
+          </w:p>
+        </w:tc>
+        <w:tc>
+          <w:tcPr>
+            <w:tcW w:type="dxa" w:w="3249"/>
+          </w:tcPr>
+          <w:p>
+            <w:r>
+              <w:rPr>
+                <w:b/>
+                <w:sz w:val="17"/>
+              </w:rPr>
+            </w:r>
+            <w:r>
+              <w:rPr>
+                <w:b/>
+                <w:sz w:val="17"/>
+              </w:rPr>
+              <w:t xml:space="preserve">Base core (all </w:t>
+            </w:r>
+            <w:r>
+              <w:rPr>
+                <w:rFonts w:ascii="DejaVu Sans Mono" w:hAnsi="DejaVu Sans Mono"/>
+                <w:b/>
+                <w:sz w:val="17"/>
+              </w:rPr>
+              <w:t>*_EN=0</w:t>
+            </w:r>
+            <w:r>
+              <w:rPr>
+                <w:b/>
+                <w:sz w:val="17"/>
+              </w:rPr>
+              <w:t>)</w:t>
+            </w:r>
+          </w:p>
+        </w:tc>
+        <w:tc>
+          <w:tcPr>
+            <w:tcW w:type="dxa" w:w="3249"/>
+          </w:tcPr>
+          <w:p>
+            <w:r>
+              <w:rPr>
+                <w:b/>
+                <w:sz w:val="17"/>
+              </w:rPr>
+            </w:r>
+            <w:r>
+              <w:rPr>
+                <w:b/>
+                <w:sz w:val="17"/>
+              </w:rPr>
+              <w:t>All features enabled</w:t>
+            </w:r>
+          </w:p>
+        </w:tc>
+      </w:tr>
+      <w:tr>
+        <w:tc>
+          <w:tcPr>
+            <w:tcW w:type="dxa" w:w="3249"/>
+          </w:tcPr>
+          <w:p>
+            <w:r>
+              <w:rPr>
+                <w:sz w:val="17"/>
+              </w:rPr>
+            </w:r>
+            <w:r>
+              <w:rPr>
+                <w:sz w:val="17"/>
+              </w:rPr>
+              <w:t>Fmax (nextpnr-ice40, HX8K)</w:t>
+            </w:r>
+          </w:p>
+        </w:tc>
+        <w:tc>
+          <w:tcPr>
+            <w:tcW w:type="dxa" w:w="3249"/>
+          </w:tcPr>
+          <w:p>
+            <w:r>
+              <w:rPr>
+                <w:sz w:val="17"/>
+              </w:rPr>
+            </w:r>
+            <w:r>
+              <w:rPr>
+                <w:sz w:val="17"/>
+              </w:rPr>
+              <w:t>141.78 MHz</w:t>
+            </w:r>
+          </w:p>
+        </w:tc>
+        <w:tc>
+          <w:tcPr>
+            <w:tcW w:type="dxa" w:w="3249"/>
+          </w:tcPr>
+          <w:p>
+            <w:r>
+              <w:rPr>
+                <w:sz w:val="17"/>
+              </w:rPr>
+            </w:r>
+            <w:r>
+              <w:rPr>
+                <w:sz w:val="17"/>
+              </w:rPr>
+              <w:t>73.87 MHz</w:t>
+            </w:r>
+          </w:p>
+        </w:tc>
+      </w:tr>
+      <w:tr>
+        <w:tc>
+          <w:tcPr>
+            <w:tcW w:type="dxa" w:w="3249"/>
+          </w:tcPr>
+          <w:p>
+            <w:r>
+              <w:rPr>
+                <w:sz w:val="17"/>
+              </w:rPr>
+            </w:r>
+            <w:r>
+              <w:rPr>
+                <w:sz w:val="17"/>
+              </w:rPr>
+              <w:t>iCE40 LUT4 / DFF</w:t>
+            </w:r>
+          </w:p>
+        </w:tc>
+        <w:tc>
+          <w:tcPr>
+            <w:tcW w:type="dxa" w:w="3249"/>
+          </w:tcPr>
+          <w:p>
+            <w:r>
+              <w:rPr>
+                <w:sz w:val="17"/>
+              </w:rPr>
+            </w:r>
+            <w:r>
+              <w:rPr>
+                <w:sz w:val="17"/>
+              </w:rPr>
+              <w:t>174 / 88</w:t>
+            </w:r>
+          </w:p>
+        </w:tc>
+        <w:tc>
+          <w:tcPr>
+            <w:tcW w:type="dxa" w:w="3249"/>
+          </w:tcPr>
+          <w:p>
+            <w:r>
+              <w:rPr>
+                <w:sz w:val="17"/>
+              </w:rPr>
+            </w:r>
+            <w:r>
+              <w:rPr>
+                <w:sz w:val="17"/>
+              </w:rPr>
+              <w:t>585 / 318</w:t>
+            </w:r>
+          </w:p>
+        </w:tc>
+      </w:tr>
+      <w:tr>
+        <w:tc>
+          <w:tcPr>
+            <w:tcW w:type="dxa" w:w="3249"/>
+          </w:tcPr>
+          <w:p>
+            <w:r>
+              <w:rPr>
+                <w:sz w:val="17"/>
+              </w:rPr>
+            </w:r>
+            <w:r>
+              <w:rPr>
+                <w:sz w:val="17"/>
+              </w:rPr>
+              <w:t>Generic cells / logic depth</w:t>
+            </w:r>
+          </w:p>
+        </w:tc>
+        <w:tc>
+          <w:tcPr>
+            <w:tcW w:type="dxa" w:w="3249"/>
+          </w:tcPr>
+          <w:p>
+            <w:r>
+              <w:rPr>
+                <w:sz w:val="17"/>
+              </w:rPr>
+            </w:r>
+            <w:r>
+              <w:rPr>
+                <w:sz w:val="17"/>
+              </w:rPr>
+              <w:t>889 / 25 gates</w:t>
+            </w:r>
+          </w:p>
+        </w:tc>
+        <w:tc>
+          <w:tcPr>
+            <w:tcW w:type="dxa" w:w="3249"/>
+          </w:tcPr>
+          <w:p>
+            <w:r>
+              <w:rPr>
+                <w:sz w:val="17"/>
+              </w:rPr>
+            </w:r>
+            <w:r>
+              <w:rPr>
+                <w:sz w:val="17"/>
+              </w:rPr>
+              <w:t>2698 / 31 gates</w:t>
+            </w:r>
+          </w:p>
+        </w:tc>
+      </w:tr>
+      <w:tr>
+        <w:tc>
+          <w:tcPr>
+            <w:tcW w:type="dxa" w:w="3249"/>
+          </w:tcPr>
+          <w:p>
+            <w:r>
+              <w:rPr>
+                <w:sz w:val="17"/>
+              </w:rPr>
+            </w:r>
+            <w:r>
+              <w:rPr>
+                <w:sz w:val="17"/>
+              </w:rPr>
+              <w:t>Random TB (3 seeds)</w:t>
+            </w:r>
+          </w:p>
+        </w:tc>
+        <w:tc>
+          <w:tcPr>
+            <w:tcW w:type="dxa" w:w="3249"/>
+          </w:tcPr>
+          <w:p>
+            <w:r>
+              <w:rPr>
+                <w:sz w:val="17"/>
+              </w:rPr>
+            </w:r>
+            <w:r>
+              <w:rPr>
+                <w:sz w:val="17"/>
+              </w:rPr>
+              <w:t>12/12 groups PASS per seed</w:t>
+            </w:r>
+          </w:p>
+        </w:tc>
+        <w:tc>
+          <w:tcPr>
+            <w:tcW w:type="dxa" w:w="3249"/>
+          </w:tcPr>
+          <w:p>
+            <w:r>
+              <w:rPr>
+                <w:sz w:val="17"/>
+              </w:rPr>
+            </w:r>
+            <w:r>
+              <w:rPr>
+                <w:sz w:val="17"/>
+              </w:rPr>
+              <w:t xml:space="preserve">12/12 PASS per seed with </w:t>
+            </w:r>
+            <w:r>
+              <w:rPr>
+                <w:rFonts w:ascii="DejaVu Sans Mono" w:hAnsi="DejaVu Sans Mono"/>
+                <w:sz w:val="17"/>
+              </w:rPr>
+              <w:t>LOWPWR_EN=1 LINEMON_EN=1</w:t>
+            </w:r>
+          </w:p>
+        </w:tc>
+      </w:tr>
+      <w:tr>
+        <w:tc>
+          <w:tcPr>
+            <w:tcW w:type="dxa" w:w="3249"/>
+          </w:tcPr>
+          <w:p>
+            <w:r>
+              <w:rPr>
+                <w:sz w:val="17"/>
+              </w:rPr>
+            </w:r>
+            <w:r>
+              <w:rPr>
+                <w:sz w:val="17"/>
+              </w:rPr>
+              <w:t>Feature TB (auto-baud, ECC, monitor)</w:t>
+            </w:r>
+          </w:p>
+        </w:tc>
+        <w:tc>
+          <w:tcPr>
+            <w:tcW w:type="dxa" w:w="3249"/>
+          </w:tcPr>
+          <w:p>
+            <w:r>
+              <w:rPr>
+                <w:sz w:val="17"/>
+              </w:rPr>
+            </w:r>
+            <w:r>
+              <w:rPr>
+                <w:sz w:val="17"/>
+              </w:rPr>
+              <w:t>–</w:t>
+            </w:r>
+          </w:p>
+        </w:tc>
+        <w:tc>
+          <w:tcPr>
+            <w:tcW w:type="dxa" w:w="3249"/>
+          </w:tcPr>
+          <w:p>
+            <w:r>
+              <w:rPr>
+                <w:sz w:val="17"/>
+              </w:rPr>
+            </w:r>
+            <w:r>
+              <w:rPr>
+                <w:sz w:val="17"/>
+              </w:rPr>
+              <w:t>9/9 runs PASS (3 seeds × 3 clocks)</w:t>
+            </w:r>
+          </w:p>
+        </w:tc>
+      </w:tr>
+      <w:tr>
+        <w:tc>
+          <w:tcPr>
+            <w:tcW w:type="dxa" w:w="3249"/>
+          </w:tcPr>
+          <w:p>
+            <w:r>
+              <w:rPr>
+                <w:sz w:val="17"/>
+              </w:rPr>
+            </w:r>
+            <w:r>
+              <w:rPr>
+                <w:sz w:val="17"/>
+              </w:rPr>
+              <w:t>Injected bugs caught by SVA</w:t>
+            </w:r>
+          </w:p>
+        </w:tc>
+        <w:tc>
+          <w:tcPr>
+            <w:tcW w:type="dxa" w:w="3249"/>
+          </w:tcPr>
+          <w:p>
+            <w:r>
+              <w:rPr>
+                <w:sz w:val="17"/>
+              </w:rPr>
+            </w:r>
+            <w:r>
+              <w:rPr>
+                <w:sz w:val="17"/>
+              </w:rPr>
+              <w:t>4/4</w:t>
+            </w:r>
+          </w:p>
+        </w:tc>
+        <w:tc>
+          <w:tcPr>
+            <w:tcW w:type="dxa" w:w="3249"/>
+          </w:tcPr>
+          <w:p>
+            <w:r>
+              <w:rPr>
+                <w:sz w:val="17"/>
+              </w:rPr>
+            </w:r>
+            <w:r>
+              <w:rPr>
+                <w:sz w:val="17"/>
+              </w:rPr>
+              <w:t>not run separately</w:t>
+            </w:r>
+          </w:p>
+        </w:tc>
+      </w:tr>
+    </w:tbl>
+    <w:p/>
+    <w:tbl>
+      <w:tblPr>
+        <w:tblStyle w:val="TableGrid"/>
+        <w:tblW w:type="auto" w:w="0"/>
+        <w:tblLook w:firstColumn="1" w:firstRow="1" w:lastColumn="0" w:lastRow="0" w:noHBand="0" w:noVBand="1" w:val="04A0"/>
+      </w:tblPr>
+      <w:tblGrid>
+        <w:gridCol w:w="3249"/>
+        <w:gridCol w:w="3249"/>
+        <w:gridCol w:w="3249"/>
+      </w:tblGrid>
+      <w:tr>
+        <w:tc>
+          <w:tcPr>
+            <w:tcW w:type="dxa" w:w="3249"/>
+          </w:tcPr>
+          <w:p>
+            <w:r>
+              <w:rPr>
+                <w:b/>
+                <w:sz w:val="17"/>
+              </w:rPr>
+            </w:r>
+            <w:r>
+              <w:rPr>
+                <w:b/>
+                <w:sz w:val="17"/>
+              </w:rPr>
+              <w:t>Parameter</w:t>
+            </w:r>
+          </w:p>
+        </w:tc>
+        <w:tc>
+          <w:tcPr>
+            <w:tcW w:type="dxa" w:w="3249"/>
+          </w:tcPr>
+          <w:p>
+            <w:r>
+              <w:rPr>
+                <w:b/>
+                <w:sz w:val="17"/>
+              </w:rPr>
+            </w:r>
+            <w:r>
+              <w:rPr>
+                <w:rFonts w:ascii="DejaVu Sans Mono" w:hAnsi="DejaVu Sans Mono"/>
+                <w:b/>
+                <w:sz w:val="17"/>
+              </w:rPr>
+              <w:t>LOWPWR_EN=0</w:t>
+            </w:r>
+          </w:p>
+        </w:tc>
+        <w:tc>
+          <w:tcPr>
+            <w:tcW w:type="dxa" w:w="3249"/>
+          </w:tcPr>
+          <w:p>
+            <w:r>
+              <w:rPr>
+                <w:b/>
+                <w:sz w:val="17"/>
+              </w:rPr>
+            </w:r>
+            <w:r>
+              <w:rPr>
+                <w:rFonts w:ascii="DejaVu Sans Mono" w:hAnsi="DejaVu Sans Mono"/>
+                <w:b/>
+                <w:sz w:val="17"/>
+              </w:rPr>
+              <w:t>LOWPWR_EN=1</w:t>
+            </w:r>
+          </w:p>
+        </w:tc>
+      </w:tr>
+      <w:tr>
+        <w:tc>
+          <w:tcPr>
+            <w:tcW w:type="dxa" w:w="3249"/>
+          </w:tcPr>
+          <w:p>
+            <w:r>
+              <w:rPr>
+                <w:sz w:val="17"/>
+              </w:rPr>
+            </w:r>
+            <w:r>
+              <w:rPr>
+                <w:sz w:val="17"/>
+              </w:rPr>
+              <w:t>Idle toggles (VCD, clock excluded)</w:t>
+            </w:r>
+          </w:p>
+        </w:tc>
+        <w:tc>
+          <w:tcPr>
+            <w:tcW w:type="dxa" w:w="3249"/>
+          </w:tcPr>
+          <w:p>
+            <w:r>
+              <w:rPr>
+                <w:sz w:val="17"/>
+              </w:rPr>
+            </w:r>
+            <w:r>
+              <w:rPr>
+                <w:sz w:val="17"/>
+              </w:rPr>
+              <w:t>15,206,486</w:t>
+            </w:r>
+          </w:p>
+        </w:tc>
+        <w:tc>
+          <w:tcPr>
+            <w:tcW w:type="dxa" w:w="3249"/>
+          </w:tcPr>
+          <w:p>
+            <w:r>
+              <w:rPr>
+                <w:sz w:val="17"/>
+              </w:rPr>
+            </w:r>
+            <w:r>
+              <w:rPr>
+                <w:sz w:val="17"/>
+              </w:rPr>
+              <w:t>127</w:t>
+            </w:r>
+          </w:p>
+        </w:tc>
+      </w:tr>
+      <w:tr>
+        <w:tc>
+          <w:tcPr>
+            <w:tcW w:type="dxa" w:w="3249"/>
+          </w:tcPr>
+          <w:p>
+            <w:r>
+              <w:rPr>
+                <w:sz w:val="17"/>
+              </w:rPr>
+            </w:r>
+            <w:r>
+              <w:rPr>
+                <w:sz w:val="17"/>
+              </w:rPr>
+              <w:t>Active toggles</w:t>
+            </w:r>
+          </w:p>
+        </w:tc>
+        <w:tc>
+          <w:tcPr>
+            <w:tcW w:type="dxa" w:w="3249"/>
+          </w:tcPr>
+          <w:p>
+            <w:r>
+              <w:rPr>
+                <w:sz w:val="17"/>
+              </w:rPr>
+            </w:r>
+            <w:r>
+              <w:rPr>
+                <w:sz w:val="17"/>
+              </w:rPr>
+              <w:t>802,085</w:t>
+            </w:r>
+          </w:p>
+        </w:tc>
+        <w:tc>
+          <w:tcPr>
+            <w:tcW w:type="dxa" w:w="3249"/>
+          </w:tcPr>
+          <w:p>
+            <w:r>
+              <w:rPr>
+                <w:sz w:val="17"/>
+              </w:rPr>
+            </w:r>
+            <w:r>
+              <w:rPr>
+                <w:sz w:val="17"/>
+              </w:rPr>
+              <w:t>777,894</w:t>
+            </w:r>
+          </w:p>
+        </w:tc>
+      </w:tr>
+      <w:tr>
+        <w:tc>
+          <w:tcPr>
+            <w:tcW w:type="dxa" w:w="3249"/>
+          </w:tcPr>
+          <w:p>
+            <w:r>
+              <w:rPr>
+                <w:sz w:val="17"/>
+              </w:rPr>
+            </w:r>
+            <w:r>
+              <w:rPr>
+                <w:sz w:val="17"/>
+              </w:rPr>
+              <w:t>Bytes received</w:t>
+            </w:r>
+          </w:p>
+        </w:tc>
+        <w:tc>
+          <w:tcPr>
+            <w:tcW w:type="dxa" w:w="3249"/>
+          </w:tcPr>
+          <w:p>
+            <w:r>
+              <w:rPr>
+                <w:sz w:val="17"/>
+              </w:rPr>
+            </w:r>
+            <w:r>
+              <w:rPr>
+                <w:sz w:val="17"/>
+              </w:rPr>
+              <w:t>40/40</w:t>
+            </w:r>
+          </w:p>
+        </w:tc>
+        <w:tc>
+          <w:tcPr>
+            <w:tcW w:type="dxa" w:w="3249"/>
+          </w:tcPr>
+          <w:p>
+            <w:r>
+              <w:rPr>
+                <w:sz w:val="17"/>
+              </w:rPr>
+            </w:r>
+            <w:r>
+              <w:rPr>
+                <w:sz w:val="17"/>
+              </w:rPr>
+              <w:t>40/40</w:t>
+            </w:r>
+          </w:p>
+        </w:tc>
+      </w:tr>
+    </w:tbl>
+    <w:p/>
+    <w:p>
+      <w:r>
+        <w:t xml:space="preserve">Both configurations use </w:t>
+      </w:r>
+      <w:r>
+        <w:rPr>
+          <w:rFonts w:ascii="DejaVu Sans Mono" w:hAnsi="DejaVu Sans Mono"/>
+          <w:sz w:val="18"/>
+        </w:rPr>
+        <w:t>DIV_W=16</w:t>
+      </w:r>
+      <w:r>
+        <w:t xml:space="preserve"> and parity support. Synthesis numbers are from </w:t>
+      </w:r>
+      <w:r>
+        <w:rPr>
+          <w:rFonts w:ascii="DejaVu Sans Mono" w:hAnsi="DejaVu Sans Mono"/>
+          <w:sz w:val="18"/>
+        </w:rPr>
+        <w:t>logs/synth_summary.log</w:t>
+      </w:r>
+      <w:r>
+        <w:t>. The negative tests ran on the testbenches' default (base) configuration. Toggle counts are an activity proxy, not a power measurement. Loopback (772/772) and the edge-case runs (6/6) were done on the base core.</w:t>
       </w:r>
     </w:p>
     <w:p>
-      <w:r>
-        <w:t>I used two flows:</w:t>
+      <w:pPr>
+        <w:pStyle w:val="Heading2"/>
+      </w:pPr>
+      <w:r>
+        <w:t>10.1 Synthesis per feature</w:t>
+      </w:r>
+    </w:p>
+    <w:p>
+      <w:r>
+        <w:t>I used three flows:</w:t>
       </w:r>
     </w:p>
     <w:p>
@@ -10039,7 +11092,113 @@
         <w:pStyle w:val="Heading1"/>
       </w:pPr>
       <w:r>
-        <w:t>8. Limitations</w:t>
+        <w:t>11. Engineering Justification</w:t>
+      </w:r>
+    </w:p>
+    <w:p>
+      <w:r>
+        <w:rPr>
+          <w:b/>
+        </w:rPr>
+        <w:t>16x oversampling with mid-bit sampling.</w:t>
+      </w:r>
+      <w:r>
+        <w:t xml:space="preserve"> Sampling once per bit at the middle gives about ±50% of a bit of margin, which is enough for the ±2-3% mismatch I tested. 16 ticks per bit lets the receiver find the middle within 1/16 bit and also gives the drift measurement used by the line monitor. A lower ratio (for example 8x) would make the counters smaller but would give coarser drift and less glitch rejection.</w:t>
+      </w:r>
+    </w:p>
+    <w:p>
+      <w:r>
+        <w:rPr>
+          <w:b/>
+        </w:rPr>
+        <w:t>Separate TX and RX baud generators.</w:t>
+      </w:r>
+      <w:r>
+        <w:t xml:space="preserve"> One shared generator would be smaller, but the RX needs to re-phase its counter on every start edge, and the low-power mode needs to stop each side on its own.</w:t>
+      </w:r>
+    </w:p>
+    <w:p>
+      <w:r>
+        <w:rPr>
+          <w:b/>
+        </w:rPr>
+        <w:t>Parameters with generate blocks instead of always-on features.</w:t>
+      </w:r>
+      <w:r>
+        <w:t xml:space="preserve"> The synthesis table shows why: all features together cost 585 LUT4 against 174 for the base core, and the Fmax estimate drops from 141.78 to 73.87 MHz. A user who only needs a plain UART should not pay for that.</w:t>
+      </w:r>
+    </w:p>
+    <w:p>
+      <w:r>
+        <w:rPr>
+          <w:b/>
+        </w:rPr>
+        <w:t>Auto-baud over 8 bit-times.</w:t>
+      </w:r>
+      <w:r>
+        <w:t xml:space="preserve"> Measuring the 1st to 5th falling edge of 0x55 (128 ticks) instead of a single bit averages out the ±1 clock synchronizer jitter. The locked divisor was the nearest integer to the ideal value at all 24 baud/clock points.</w:t>
+      </w:r>
+    </w:p>
+    <w:p>
+      <w:r>
+        <w:rPr>
+          <w:b/>
+        </w:rPr>
+        <w:t>SECDED over two frames.</w:t>
+      </w:r>
+      <w:r>
+        <w:t xml:space="preserve"> Keeping the 8-bit frame means the line stays a normal UART. The cost is half the throughput, which is acceptable for the noisy-line case this feature is for.</w:t>
+      </w:r>
+    </w:p>
+    <w:p>
+      <w:r>
+        <w:rPr>
+          <w:b/>
+        </w:rPr>
+        <w:t>Clock enables instead of gating the clock.</w:t>
+      </w:r>
+      <w:r>
+        <w:t xml:space="preserve"> Gating the clock in RTL is unsafe on an FPGA. Using flop enables is safe and drops idle toggles from 15,206,486 to 127 in my test.</w:t>
+      </w:r>
+    </w:p>
+    <w:p>
+      <w:r>
+        <w:rPr>
+          <w:b/>
+        </w:rPr>
+        <w:t>Verilator for SVA, Icarus for small tests.</w:t>
+      </w:r>
+      <w:r>
+        <w:t xml:space="preserve"> Verilator 5.032 runs the concurrent assertions with </w:t>
+      </w:r>
+      <w:r>
+        <w:rPr>
+          <w:rFonts w:ascii="DejaVu Sans Mono" w:hAnsi="DejaVu Sans Mono"/>
+          <w:sz w:val="18"/>
+        </w:rPr>
+        <w:t>--assert</w:t>
+      </w:r>
+      <w:r>
+        <w:t xml:space="preserve"> and is fast enough for the long randomized runs. Icarus is kept for the simple tests because it also runs on Windows, so those can be checked on my laptop.</w:t>
+      </w:r>
+    </w:p>
+    <w:p>
+      <w:r>
+        <w:rPr>
+          <w:b/>
+        </w:rPr>
+        <w:t>Negative tests.</w:t>
+      </w:r>
+      <w:r>
+        <w:t xml:space="preserve"> An assertion that never fails proves nothing. Each of the four injected bugs was caught by a different assertion (A5, A2, B1b, B2), which shows they are actually evaluated.</w:t>
+      </w:r>
+    </w:p>
+    <w:p>
+      <w:pPr>
+        <w:pStyle w:val="Heading1"/>
+      </w:pPr>
+      <w:r>
+        <w:t>12. Limitations</w:t>
       </w:r>
     </w:p>
     <w:p>
@@ -10113,7 +11272,7 @@
         <w:pStyle w:val="Heading1"/>
       </w:pPr>
       <w:r>
-        <w:t>9. Future work</w:t>
+        <w:t>13. Proposed Improvement</w:t>
       </w:r>
     </w:p>
     <w:p>
@@ -10161,73 +11320,12 @@
         <w:pStyle w:val="Heading1"/>
       </w:pPr>
       <w:r>
-        <w:t>10. Conclusion</w:t>
+        <w:t>14. Conclusion</w:t>
       </w:r>
     </w:p>
     <w:p>
       <w:r>
-        <w:t>The UART core works as designed, as the saved logs show:</w:t>
-      </w:r>
-    </w:p>
-    <w:p>
-      <w:pPr>
-        <w:pStyle w:val="ListBullet"/>
-      </w:pPr>
-      <w:r>
-        <w:t>772/772 loopback bytes across the three parity modes;</w:t>
-      </w:r>
-    </w:p>
-    <w:p>
-      <w:pPr>
-        <w:pStyle w:val="ListBullet"/>
-      </w:pPr>
-      <w:r>
-        <w:t>12/12 random test groups for three seeds in two configurations;</w:t>
-      </w:r>
-    </w:p>
-    <w:p>
-      <w:pPr>
-        <w:pStyle w:val="ListBullet"/>
-      </w:pPr>
-      <w:r>
-        <w:t>6/6 edge-case runs (divisor 1 to 65535, reset in every TX/RX state, malformed frames);</w:t>
-      </w:r>
-    </w:p>
-    <w:p>
-      <w:pPr>
-        <w:pStyle w:val="ListBullet"/>
-      </w:pPr>
-      <w:r>
-        <w:t>auto-baud locked to the nearest divisor at every point tested;</w:t>
-      </w:r>
-    </w:p>
-    <w:p>
-      <w:pPr>
-        <w:pStyle w:val="ListBullet"/>
-      </w:pPr>
-      <w:r>
-        <w:t>SECDED corrected every single flip and detected every double flip;</w:t>
-      </w:r>
-    </w:p>
-    <w:p>
-      <w:pPr>
-        <w:pStyle w:val="ListBullet"/>
-      </w:pPr>
-      <w:r>
-        <w:t>the low-power mode cut idle switching activity to almost nothing;</w:t>
-      </w:r>
-    </w:p>
-    <w:p>
-      <w:pPr>
-        <w:pStyle w:val="ListBullet"/>
-      </w:pPr>
-      <w:r>
-        <w:t>the line monitor counters matched the injected errors exactly.</w:t>
-      </w:r>
-    </w:p>
-    <w:p>
-      <w:r>
-        <w:t>The assertions caught all four deliberately injected bugs. With every feature enabled, the core takes 585 iCE40 LUTs and reaches 73.87 MHz on iCE40 HX8K, compared with 174 LUTs and 141.78 MHz for the base core.</w:t>
+        <w:t>A configurable UART core was written in Verilog and verified in simulation. The logs show 772/772 loopback bytes across three parity modes, 12/12 random test groups for three seeds in two configurations, 6/6 edge-case runs (divisor 1 to 65535, reset in every TX/RX state, malformed frames), auto-baud locking to the nearest divisor at every point tested, SECDED correcting every single flip and detecting every double flip, and line-monitor counters that matched the injected errors exactly. The assertions caught all four injected bugs. The low-power mode cut idle switching activity from 15,206,486 to 127 toggles. With every feature enabled the core takes 585 iCE40 LUT4 and reaches an estimated 73.87 MHz on iCE40 HX8K, compared with 174 LUT4 and 141.78 MHz for the base core. These results are from simulation and synthesis only; the core has not been tested on hardware.</w:t>
       </w:r>
     </w:p>
     <w:p>

</xml_diff>

<commit_message>
Remove box-generated waveform plots and xterm capture; point text to the laptop GTKWave screenshots and renumber figures
</commit_message>
<xml_diff>
--- a/report/UART_IP_Core_Report.docx
+++ b/report/UART_IP_Core_Report.docx
@@ -3224,153 +3224,28 @@
       </w:r>
     </w:p>
     <w:p>
-      <w:pPr>
-        <w:jc w:val="center"/>
-      </w:pPr>
-      <w:r>
-        <w:drawing>
-          <wp:inline xmlns:a="http://schemas.openxmlformats.org/drawingml/2006/main" xmlns:pic="http://schemas.openxmlformats.org/drawingml/2006/picture">
-            <wp:extent cx="5580000" cy="2921891"/>
-            <wp:docPr id="7" name="Picture 7"/>
-            <wp:cNvGraphicFramePr>
-              <a:graphicFrameLocks noChangeAspect="1"/>
-            </wp:cNvGraphicFramePr>
-            <a:graphic>
-              <a:graphicData uri="http://schemas.openxmlformats.org/drawingml/2006/picture">
-                <pic:pic>
-                  <pic:nvPicPr>
-                    <pic:cNvPr id="0" name="wave_loopback.png"/>
-                    <pic:cNvPicPr/>
-                  </pic:nvPicPr>
-                  <pic:blipFill>
-                    <a:blip r:embed="rId15"/>
-                    <a:stretch>
-                      <a:fillRect/>
-                    </a:stretch>
-                  </pic:blipFill>
-                  <pic:spPr>
-                    <a:xfrm>
-                      <a:off x="0" y="0"/>
-                      <a:ext cx="5580000" cy="2921891"/>
-                    </a:xfrm>
-                    <a:prstGeom prst="rect"/>
-                  </pic:spPr>
-                </pic:pic>
-              </a:graphicData>
-            </a:graphic>
-          </wp:inline>
-        </w:drawing>
-      </w:r>
-    </w:p>
-    <w:p>
-      <w:pPr>
-        <w:jc w:val="center"/>
-      </w:pPr>
+      <w:r>
+        <w:t xml:space="preserve">The loopback run is shown in GTKWave in Figure G1 (Section 9.8): back-to-back frames, with </w:t>
+      </w:r>
       <w:r>
         <w:rPr>
-          <w:i/>
+          <w:rFonts w:ascii="DejaVu Sans Mono" w:hAnsi="DejaVu Sans Mono"/>
+          <w:sz w:val="18"/>
         </w:rPr>
-        <w:t>Figure 7: Back-to-back frames from waves/tb_loopback.vcd. rx_valid fires at the mid-stop sample, before tx_done.</w:t>
-      </w:r>
-    </w:p>
-    <w:p>
-      <w:pPr>
-        <w:jc w:val="center"/>
-      </w:pPr>
-      <w:r>
-        <w:drawing>
-          <wp:inline xmlns:a="http://schemas.openxmlformats.org/drawingml/2006/main" xmlns:pic="http://schemas.openxmlformats.org/drawingml/2006/picture">
-            <wp:extent cx="5580000" cy="3865418"/>
-            <wp:docPr id="8" name="Picture 8"/>
-            <wp:cNvGraphicFramePr>
-              <a:graphicFrameLocks noChangeAspect="1"/>
-            </wp:cNvGraphicFramePr>
-            <a:graphic>
-              <a:graphicData uri="http://schemas.openxmlformats.org/drawingml/2006/picture">
-                <pic:pic>
-                  <pic:nvPicPr>
-                    <pic:cNvPr id="0" name="wave_zoom.png"/>
-                    <pic:cNvPicPr/>
-                  </pic:nvPicPr>
-                  <pic:blipFill>
-                    <a:blip r:embed="rId16"/>
-                    <a:stretch>
-                      <a:fillRect/>
-                    </a:stretch>
-                  </pic:blipFill>
-                  <pic:spPr>
-                    <a:xfrm>
-                      <a:off x="0" y="0"/>
-                      <a:ext cx="5580000" cy="3865418"/>
-                    </a:xfrm>
-                    <a:prstGeom prst="rect"/>
-                  </pic:spPr>
-                </pic:pic>
-              </a:graphicData>
-            </a:graphic>
-          </wp:inline>
-        </w:drawing>
-      </w:r>
-    </w:p>
-    <w:p>
-      <w:pPr>
-        <w:jc w:val="center"/>
-      </w:pPr>
+        <w:t>rx_valid</w:t>
+      </w:r>
+      <w:r>
+        <w:t xml:space="preserve"> firing at the mid-stop sample, before </w:t>
+      </w:r>
       <w:r>
         <w:rPr>
-          <w:i/>
+          <w:rFonts w:ascii="DejaVu Sans Mono" w:hAnsi="DejaVu Sans Mono"/>
+          <w:sz w:val="18"/>
         </w:rPr>
-        <w:t>Figure 8: Zoom on a start bit: 16x ticks, and the RX tick counter loaded with 8 on the start edge (mid-bit alignment).</w:t>
-      </w:r>
-    </w:p>
-    <w:p>
-      <w:pPr>
-        <w:jc w:val="center"/>
-      </w:pPr>
-      <w:r>
-        <w:drawing>
-          <wp:inline xmlns:a="http://schemas.openxmlformats.org/drawingml/2006/main" xmlns:pic="http://schemas.openxmlformats.org/drawingml/2006/picture">
-            <wp:extent cx="5580000" cy="2921891"/>
-            <wp:docPr id="9" name="Picture 9"/>
-            <wp:cNvGraphicFramePr>
-              <a:graphicFrameLocks noChangeAspect="1"/>
-            </wp:cNvGraphicFramePr>
-            <a:graphic>
-              <a:graphicData uri="http://schemas.openxmlformats.org/drawingml/2006/picture">
-                <pic:pic>
-                  <pic:nvPicPr>
-                    <pic:cNvPr id="0" name="wave_even.png"/>
-                    <pic:cNvPicPr/>
-                  </pic:nvPicPr>
-                  <pic:blipFill>
-                    <a:blip r:embed="rId17"/>
-                    <a:stretch>
-                      <a:fillRect/>
-                    </a:stretch>
-                  </pic:blipFill>
-                  <pic:spPr>
-                    <a:xfrm>
-                      <a:off x="0" y="0"/>
-                      <a:ext cx="5580000" cy="2921891"/>
-                    </a:xfrm>
-                    <a:prstGeom prst="rect"/>
-                  </pic:spPr>
-                </pic:pic>
-              </a:graphicData>
-            </a:graphic>
-          </wp:inline>
-        </w:drawing>
-      </w:r>
-    </w:p>
-    <w:p>
-      <w:pPr>
-        <w:jc w:val="center"/>
-      </w:pPr>
-      <w:r>
-        <w:rPr>
-          <w:i/>
-        </w:rPr>
-        <w:t>Figure 9: One 8E1 frame from the same VCD.</w:t>
+        <w:t>tx_done</w:t>
+      </w:r>
+      <w:r>
+        <w:t>.</w:t>
       </w:r>
     </w:p>
     <w:p>
@@ -5175,7 +5050,7 @@
         <w:drawing>
           <wp:inline xmlns:a="http://schemas.openxmlformats.org/drawingml/2006/main" xmlns:pic="http://schemas.openxmlformats.org/drawingml/2006/picture">
             <wp:extent cx="5580000" cy="2371500"/>
-            <wp:docPr id="10" name="Picture 10"/>
+            <wp:docPr id="7" name="Picture 7"/>
             <wp:cNvGraphicFramePr>
               <a:graphicFrameLocks noChangeAspect="1"/>
             </wp:cNvGraphicFramePr>
@@ -5187,7 +5062,7 @@
                     <pic:cNvPicPr/>
                   </pic:nvPicPr>
                   <pic:blipFill>
-                    <a:blip r:embed="rId18"/>
+                    <a:blip r:embed="rId15"/>
                     <a:stretch>
                       <a:fillRect/>
                     </a:stretch>
@@ -5214,7 +5089,7 @@
         <w:rPr>
           <w:i/>
         </w:rPr>
-        <w:t>Figure 10: Rate error after lock.</w:t>
+        <w:t>Figure 7: Rate error after lock.</w:t>
       </w:r>
     </w:p>
     <w:p>
@@ -5924,7 +5799,7 @@
         <w:drawing>
           <wp:inline xmlns:a="http://schemas.openxmlformats.org/drawingml/2006/main" xmlns:pic="http://schemas.openxmlformats.org/drawingml/2006/picture">
             <wp:extent cx="5580000" cy="2790000"/>
-            <wp:docPr id="11" name="Picture 11"/>
+            <wp:docPr id="8" name="Picture 8"/>
             <wp:cNvGraphicFramePr>
               <a:graphicFrameLocks noChangeAspect="1"/>
             </wp:cNvGraphicFramePr>
@@ -5936,7 +5811,7 @@
                     <pic:cNvPicPr/>
                   </pic:nvPicPr>
                   <pic:blipFill>
-                    <a:blip r:embed="rId19"/>
+                    <a:blip r:embed="rId16"/>
                     <a:stretch>
                       <a:fillRect/>
                     </a:stretch>
@@ -5963,57 +5838,22 @@
         <w:rPr>
           <w:i/>
         </w:rPr>
-        <w:t>Figure 11: VCD toggle counts.</w:t>
+        <w:t>Figure 8: VCD toggle counts.</w:t>
       </w:r>
     </w:p>
     <w:p>
-      <w:pPr>
-        <w:jc w:val="center"/>
-      </w:pPr>
-      <w:r>
-        <w:drawing>
-          <wp:inline xmlns:a="http://schemas.openxmlformats.org/drawingml/2006/main" xmlns:pic="http://schemas.openxmlformats.org/drawingml/2006/picture">
-            <wp:extent cx="5580000" cy="1663855"/>
-            <wp:docPr id="12" name="Picture 12"/>
-            <wp:cNvGraphicFramePr>
-              <a:graphicFrameLocks noChangeAspect="1"/>
-            </wp:cNvGraphicFramePr>
-            <a:graphic>
-              <a:graphicData uri="http://schemas.openxmlformats.org/drawingml/2006/picture">
-                <pic:pic>
-                  <pic:nvPicPr>
-                    <pic:cNvPr id="0" name="wave_lowpower.png"/>
-                    <pic:cNvPicPr/>
-                  </pic:nvPicPr>
-                  <pic:blipFill>
-                    <a:blip r:embed="rId20"/>
-                    <a:stretch>
-                      <a:fillRect/>
-                    </a:stretch>
-                  </pic:blipFill>
-                  <pic:spPr>
-                    <a:xfrm>
-                      <a:off x="0" y="0"/>
-                      <a:ext cx="5580000" cy="1663855"/>
-                    </a:xfrm>
-                    <a:prstGeom prst="rect"/>
-                  </pic:spPr>
-                </pic:pic>
-              </a:graphicData>
-            </a:graphic>
-          </wp:inline>
-        </w:drawing>
-      </w:r>
-    </w:p>
-    <w:p>
-      <w:pPr>
-        <w:jc w:val="center"/>
-      </w:pPr>
+      <w:r>
+        <w:t xml:space="preserve">Figure G4 (Section 9.8) shows </w:t>
+      </w:r>
       <w:r>
         <w:rPr>
-          <w:i/>
+          <w:rFonts w:ascii="DejaVu Sans Mono" w:hAnsi="DejaVu Sans Mono"/>
+          <w:sz w:val="18"/>
         </w:rPr>
-        <w:t>Figure 12: In power_lp1.vcd, the ticks run only around frames.</w:t>
+        <w:t>power_lp1.vcd</w:t>
+      </w:r>
+      <w:r>
+        <w:t xml:space="preserve"> in GTKWave: the baud counters stop between frames.</w:t>
       </w:r>
     </w:p>
     <w:p>
@@ -6828,7 +6668,7 @@
     </w:p>
     <w:p>
       <w:r>
-        <w:t>Waveforms from a traced run at DIV=4 (</w:t>
+        <w:t>The parity-error and framing-error cases from a traced run at DIV=4 (</w:t>
       </w:r>
       <w:r>
         <w:rPr>
@@ -6848,157 +6688,47 @@
         <w:t>waves/tb_edge_err.vcd</w:t>
       </w:r>
       <w:r>
-        <w:t>):</w:t>
-      </w:r>
-    </w:p>
-    <w:p>
-      <w:pPr>
-        <w:jc w:val="center"/>
-      </w:pPr>
-      <w:r>
-        <w:drawing>
-          <wp:inline xmlns:a="http://schemas.openxmlformats.org/drawingml/2006/main" xmlns:pic="http://schemas.openxmlformats.org/drawingml/2006/picture">
-            <wp:extent cx="5580000" cy="1927636"/>
-            <wp:docPr id="13" name="Picture 13"/>
-            <wp:cNvGraphicFramePr>
-              <a:graphicFrameLocks noChangeAspect="1"/>
-            </wp:cNvGraphicFramePr>
-            <a:graphic>
-              <a:graphicData uri="http://schemas.openxmlformats.org/drawingml/2006/picture">
-                <pic:pic>
-                  <pic:nvPicPr>
-                    <pic:cNvPr id="0" name="wave_txrx_timing.png"/>
-                    <pic:cNvPicPr/>
-                  </pic:nvPicPr>
-                  <pic:blipFill>
-                    <a:blip r:embed="rId21"/>
-                    <a:stretch>
-                      <a:fillRect/>
-                    </a:stretch>
-                  </pic:blipFill>
-                  <pic:spPr>
-                    <a:xfrm>
-                      <a:off x="0" y="0"/>
-                      <a:ext cx="5580000" cy="1927636"/>
-                    </a:xfrm>
-                    <a:prstGeom prst="rect"/>
-                  </pic:spPr>
-                </pic:pic>
-              </a:graphicData>
-            </a:graphic>
-          </wp:inline>
-        </w:drawing>
-      </w:r>
-    </w:p>
-    <w:p>
-      <w:pPr>
-        <w:jc w:val="center"/>
-      </w:pPr>
+        <w:t xml:space="preserve">) are shown in GTKWave in Figures G2 and G3 (Section 9.8): 0x96 with a wrong even-parity bit gives </w:t>
+      </w:r>
       <w:r>
         <w:rPr>
-          <w:i/>
+          <w:rFonts w:ascii="DejaVu Sans Mono" w:hAnsi="DejaVu Sans Mono"/>
+          <w:sz w:val="18"/>
         </w:rPr>
-        <w:t>Figure 13: back-to-back frames, DUT tx looped to rx.</w:t>
-      </w:r>
-    </w:p>
-    <w:p>
-      <w:pPr>
-        <w:jc w:val="center"/>
-      </w:pPr>
-      <w:r>
-        <w:drawing>
-          <wp:inline xmlns:a="http://schemas.openxmlformats.org/drawingml/2006/main" xmlns:pic="http://schemas.openxmlformats.org/drawingml/2006/picture">
-            <wp:extent cx="5580000" cy="1927636"/>
-            <wp:docPr id="14" name="Picture 14"/>
-            <wp:cNvGraphicFramePr>
-              <a:graphicFrameLocks noChangeAspect="1"/>
-            </wp:cNvGraphicFramePr>
-            <a:graphic>
-              <a:graphicData uri="http://schemas.openxmlformats.org/drawingml/2006/picture">
-                <pic:pic>
-                  <pic:nvPicPr>
-                    <pic:cNvPr id="0" name="wave_parity_err.png"/>
-                    <pic:cNvPicPr/>
-                  </pic:nvPicPr>
-                  <pic:blipFill>
-                    <a:blip r:embed="rId22"/>
-                    <a:stretch>
-                      <a:fillRect/>
-                    </a:stretch>
-                  </pic:blipFill>
-                  <pic:spPr>
-                    <a:xfrm>
-                      <a:off x="0" y="0"/>
-                      <a:ext cx="5580000" cy="1927636"/>
-                    </a:xfrm>
-                    <a:prstGeom prst="rect"/>
-                  </pic:spPr>
-                </pic:pic>
-              </a:graphicData>
-            </a:graphic>
-          </wp:inline>
-        </w:drawing>
-      </w:r>
-    </w:p>
-    <w:p>
-      <w:pPr>
-        <w:jc w:val="center"/>
-      </w:pPr>
+        <w:t>parity_err</w:t>
+      </w:r>
+      <w:r>
+        <w:t xml:space="preserve"> with </w:t>
+      </w:r>
       <w:r>
         <w:rPr>
-          <w:i/>
+          <w:rFonts w:ascii="DejaVu Sans Mono" w:hAnsi="DejaVu Sans Mono"/>
+          <w:sz w:val="18"/>
         </w:rPr>
-        <w:t>Figure 14: 0x96 with a wrong even-parity bit (parity_err with rx_valid), then a good 0x97.</w:t>
-      </w:r>
-    </w:p>
-    <w:p>
-      <w:pPr>
-        <w:jc w:val="center"/>
-      </w:pPr>
-      <w:r>
-        <w:drawing>
-          <wp:inline xmlns:a="http://schemas.openxmlformats.org/drawingml/2006/main" xmlns:pic="http://schemas.openxmlformats.org/drawingml/2006/picture">
-            <wp:extent cx="5580000" cy="1927636"/>
-            <wp:docPr id="15" name="Picture 15"/>
-            <wp:cNvGraphicFramePr>
-              <a:graphicFrameLocks noChangeAspect="1"/>
-            </wp:cNvGraphicFramePr>
-            <a:graphic>
-              <a:graphicData uri="http://schemas.openxmlformats.org/drawingml/2006/picture">
-                <pic:pic>
-                  <pic:nvPicPr>
-                    <pic:cNvPr id="0" name="wave_frame_err.png"/>
-                    <pic:cNvPicPr/>
-                  </pic:nvPicPr>
-                  <pic:blipFill>
-                    <a:blip r:embed="rId23"/>
-                    <a:stretch>
-                      <a:fillRect/>
-                    </a:stretch>
-                  </pic:blipFill>
-                  <pic:spPr>
-                    <a:xfrm>
-                      <a:off x="0" y="0"/>
-                      <a:ext cx="5580000" cy="1927636"/>
-                    </a:xfrm>
-                    <a:prstGeom prst="rect"/>
-                  </pic:spPr>
-                </pic:pic>
-              </a:graphicData>
-            </a:graphic>
-          </wp:inline>
-        </w:drawing>
-      </w:r>
-    </w:p>
-    <w:p>
-      <w:pPr>
-        <w:jc w:val="center"/>
-      </w:pPr>
+        <w:t>rx_valid</w:t>
+      </w:r>
+      <w:r>
+        <w:t xml:space="preserve">, and 0xC9 with stop bit 0 gives </w:t>
+      </w:r>
       <w:r>
         <w:rPr>
-          <w:i/>
+          <w:rFonts w:ascii="DejaVu Sans Mono" w:hAnsi="DejaVu Sans Mono"/>
+          <w:sz w:val="18"/>
         </w:rPr>
-        <w:t>Figure 15: 0xC9 with stop bit 0 and the line held low; frame_err pulses, no rx_valid.</w:t>
+        <w:t>frame_err</w:t>
+      </w:r>
+      <w:r>
+        <w:t xml:space="preserve"> with no </w:t>
+      </w:r>
+      <w:r>
+        <w:rPr>
+          <w:rFonts w:ascii="DejaVu Sans Mono" w:hAnsi="DejaVu Sans Mono"/>
+          <w:sz w:val="18"/>
+        </w:rPr>
+        <w:t>rx_valid</w:t>
+      </w:r>
+      <w:r>
+        <w:t>.</w:t>
       </w:r>
     </w:p>
     <w:p>
@@ -7496,7 +7226,7 @@
         <w:drawing>
           <wp:inline xmlns:a="http://schemas.openxmlformats.org/drawingml/2006/main" xmlns:pic="http://schemas.openxmlformats.org/drawingml/2006/picture">
             <wp:extent cx="5580000" cy="3146046"/>
-            <wp:docPr id="16" name="Picture 16"/>
+            <wp:docPr id="9" name="Picture 9"/>
             <wp:cNvGraphicFramePr>
               <a:graphicFrameLocks noChangeAspect="1"/>
             </wp:cNvGraphicFramePr>
@@ -7508,7 +7238,7 @@
                     <pic:cNvPicPr/>
                   </pic:nvPicPr>
                   <pic:blipFill>
-                    <a:blip r:embed="rId24"/>
+                    <a:blip r:embed="rId17"/>
                     <a:stretch>
                       <a:fillRect/>
                     </a:stretch>
@@ -7546,7 +7276,7 @@
         <w:drawing>
           <wp:inline xmlns:a="http://schemas.openxmlformats.org/drawingml/2006/main" xmlns:pic="http://schemas.openxmlformats.org/drawingml/2006/picture">
             <wp:extent cx="5580000" cy="3073803"/>
-            <wp:docPr id="17" name="Picture 17"/>
+            <wp:docPr id="10" name="Picture 10"/>
             <wp:cNvGraphicFramePr>
               <a:graphicFrameLocks noChangeAspect="1"/>
             </wp:cNvGraphicFramePr>
@@ -7558,7 +7288,7 @@
                     <pic:cNvPicPr/>
                   </pic:nvPicPr>
                   <pic:blipFill>
-                    <a:blip r:embed="rId25"/>
+                    <a:blip r:embed="rId18"/>
                     <a:stretch>
                       <a:fillRect/>
                     </a:stretch>
@@ -7596,7 +7326,7 @@
         <w:drawing>
           <wp:inline xmlns:a="http://schemas.openxmlformats.org/drawingml/2006/main" xmlns:pic="http://schemas.openxmlformats.org/drawingml/2006/picture">
             <wp:extent cx="5580000" cy="3137840"/>
-            <wp:docPr id="18" name="Picture 18"/>
+            <wp:docPr id="11" name="Picture 11"/>
             <wp:cNvGraphicFramePr>
               <a:graphicFrameLocks noChangeAspect="1"/>
             </wp:cNvGraphicFramePr>
@@ -7608,7 +7338,7 @@
                     <pic:cNvPicPr/>
                   </pic:nvPicPr>
                   <pic:blipFill>
-                    <a:blip r:embed="rId26"/>
+                    <a:blip r:embed="rId19"/>
                     <a:stretch>
                       <a:fillRect/>
                     </a:stretch>
@@ -7646,7 +7376,7 @@
         <w:drawing>
           <wp:inline xmlns:a="http://schemas.openxmlformats.org/drawingml/2006/main" xmlns:pic="http://schemas.openxmlformats.org/drawingml/2006/picture">
             <wp:extent cx="5580000" cy="3139478"/>
-            <wp:docPr id="19" name="Picture 19"/>
+            <wp:docPr id="12" name="Picture 12"/>
             <wp:cNvGraphicFramePr>
               <a:graphicFrameLocks noChangeAspect="1"/>
             </wp:cNvGraphicFramePr>
@@ -7658,7 +7388,7 @@
                     <pic:cNvPicPr/>
                   </pic:nvPicPr>
                   <pic:blipFill>
-                    <a:blip r:embed="rId27"/>
+                    <a:blip r:embed="rId20"/>
                     <a:stretch>
                       <a:fillRect/>
                     </a:stretch>
@@ -7695,58 +7425,8 @@
       <w:r>
         <w:drawing>
           <wp:inline xmlns:a="http://schemas.openxmlformats.org/drawingml/2006/main" xmlns:pic="http://schemas.openxmlformats.org/drawingml/2006/picture">
-            <wp:extent cx="5580000" cy="3379124"/>
-            <wp:docPr id="20" name="Picture 20"/>
-            <wp:cNvGraphicFramePr>
-              <a:graphicFrameLocks noChangeAspect="1"/>
-            </wp:cNvGraphicFramePr>
-            <a:graphic>
-              <a:graphicData uri="http://schemas.openxmlformats.org/drawingml/2006/picture">
-                <pic:pic>
-                  <pic:nvPicPr>
-                    <pic:cNvPr id="0" name="gtkwave_bug_rxmid_terminal.png"/>
-                    <pic:cNvPicPr/>
-                  </pic:nvPicPr>
-                  <pic:blipFill>
-                    <a:blip r:embed="rId28"/>
-                    <a:stretch>
-                      <a:fillRect/>
-                    </a:stretch>
-                  </pic:blipFill>
-                  <pic:spPr>
-                    <a:xfrm>
-                      <a:off x="0" y="0"/>
-                      <a:ext cx="5580000" cy="3379124"/>
-                    </a:xfrm>
-                    <a:prstGeom prst="rect"/>
-                  </pic:spPr>
-                </pic:pic>
-              </a:graphicData>
-            </a:graphic>
-          </wp:inline>
-        </w:drawing>
-      </w:r>
-    </w:p>
-    <w:p>
-      <w:pPr>
-        <w:jc w:val="center"/>
-      </w:pPr>
-      <w:r>
-        <w:rPr>
-          <w:i/>
-        </w:rPr>
-        <w:t>Figure G5: terminal running `make bug_demo`; the SVA error from B2.</w:t>
-      </w:r>
-    </w:p>
-    <w:p>
-      <w:pPr>
-        <w:jc w:val="center"/>
-      </w:pPr>
-      <w:r>
-        <w:drawing>
-          <wp:inline xmlns:a="http://schemas.openxmlformats.org/drawingml/2006/main" xmlns:pic="http://schemas.openxmlformats.org/drawingml/2006/picture">
             <wp:extent cx="5580000" cy="3452646"/>
-            <wp:docPr id="21" name="Picture 21"/>
+            <wp:docPr id="13" name="Picture 13"/>
             <wp:cNvGraphicFramePr>
               <a:graphicFrameLocks noChangeAspect="1"/>
             </wp:cNvGraphicFramePr>
@@ -7758,7 +7438,7 @@
                     <pic:cNvPicPr/>
                   </pic:nvPicPr>
                   <pic:blipFill>
-                    <a:blip r:embed="rId29"/>
+                    <a:blip r:embed="rId21"/>
                     <a:stretch>
                       <a:fillRect/>
                     </a:stretch>
@@ -7785,7 +7465,7 @@
         <w:rPr>
           <w:i/>
         </w:rPr>
-        <w:t>Figure G6: GTKWave on Windows 11 at the B2 failure (tb_edge_bug_rxmid.vcd, simulated with Verilator 5.032 on Linux).</w:t>
+        <w:t>Figure G5: GTKWave on Windows 11 at the B2 failure (tb_edge_bug_rxmid.vcd, simulated with Verilator 5.032 on Linux).</w:t>
       </w:r>
     </w:p>
     <w:p>
@@ -10992,7 +10672,7 @@
         <w:drawing>
           <wp:inline xmlns:a="http://schemas.openxmlformats.org/drawingml/2006/main" xmlns:pic="http://schemas.openxmlformats.org/drawingml/2006/picture">
             <wp:extent cx="5580000" cy="2232000"/>
-            <wp:docPr id="22" name="Picture 22"/>
+            <wp:docPr id="14" name="Picture 14"/>
             <wp:cNvGraphicFramePr>
               <a:graphicFrameLocks noChangeAspect="1"/>
             </wp:cNvGraphicFramePr>
@@ -11004,7 +10684,7 @@
                     <pic:cNvPicPr/>
                   </pic:nvPicPr>
                   <pic:blipFill>
-                    <a:blip r:embed="rId30"/>
+                    <a:blip r:embed="rId22"/>
                     <a:stretch>
                       <a:fillRect/>
                     </a:stretch>
@@ -11031,7 +10711,7 @@
         <w:rPr>
           <w:i/>
         </w:rPr>
-        <w:t>Figure 16: iCE40 LUT count per configuration.</w:t>
+        <w:t>Figure 9: iCE40 LUT count per configuration.</w:t>
       </w:r>
     </w:p>
     <w:p>

</xml_diff>